<commit_message>
Rebuild Word doc as honest findings and investigation memo
Removed all strategies. Document now clearly distinguishes:
- Confirmed MIRR findings (cited to source documents)
- Intern team logical analysis (labeled as such)
- Routes worth investigating (framed as questions, not recommendations)
- What GIS would add (specific analyses not yet performed)

Scope notice on cover page is explicit: no GIS analysis has been done.
US-17 corridor, landfill methane, and contamination claims all flagged
as unverified pending GIS and source confirmation.

https://claude.ai/code/session_01FS9333VimrXDDCapeqZFSA
</commit_message>
<xml_diff>
--- a/resilience_review/MIRR_Energy_Resilience_Contribution.docx
+++ b/resilience_review/MIRR_Energy_Resilience_Contribution.docx
@@ -4,7 +4,7 @@
   <w:body>
     <w:p>
       <w:pPr>
-        <w:spacing w:before="480"/>
+        <w:spacing w:before="400" w:after="80"/>
         <w:jc w:val="center"/>
       </w:pPr>
       <w:r>
@@ -20,6 +20,7 @@
     </w:p>
     <w:p>
       <w:pPr>
+        <w:spacing w:before="0" w:after="80"/>
         <w:jc w:val="center"/>
       </w:pPr>
       <w:r>
@@ -30,11 +31,12 @@
           <w:color w:val="376092"/>
           <w:sz w:val="26"/>
         </w:rPr>
-        <w:t>Energy Reliability — Intern Research Contribution</w:t>
+        <w:t>Energy Infrastructure — Preliminary Research Findings and Investigation Routes</w:t>
       </w:r>
     </w:p>
     <w:p>
       <w:pPr>
+        <w:spacing w:before="0" w:after="80"/>
         <w:jc w:val="center"/>
       </w:pPr>
       <w:r>
@@ -45,13 +47,16 @@
           <w:color w:val="595959"/>
           <w:sz w:val="20"/>
         </w:rPr>
-        <w:t>Naval Air Station Jacksonville  |  Naval Station Mayport  |  MCSF Blount Island  |  Camp Blanding JTF</w:t>
+        <w:t>Naval Air Station Jacksonville  |  Naval Station Mayport</w:t>
+        <w:br/>
+        <w:t>MCSF Blount Island  |  Camp Blanding JTF</w:t>
         <w:br/>
         <w:t>Duval County and Clay County, Florida</w:t>
       </w:r>
     </w:p>
     <w:p>
       <w:pPr>
+        <w:spacing w:before="0" w:after="240"/>
         <w:jc w:val="center"/>
       </w:pPr>
       <w:r>
@@ -65,7 +70,34 @@
         <w:t>Prepared for Supervisor Review — May 2026</w:t>
       </w:r>
     </w:p>
-    <w:p/>
+    <w:p>
+      <w:pPr>
+        <w:spacing w:after="200"/>
+        <w:ind w:left="432" w:right="432"/>
+        <w:shd w:val="clear" w:color="auto" w:fill="EAF0F8"/>
+      </w:pPr>
+      <w:r>
+        <w:rPr>
+          <w:rFonts w:ascii="Calibri" w:hAnsi="Calibri"/>
+          <w:b/>
+          <w:i w:val="0"/>
+          <w:color w:val="1F497D"/>
+          <w:sz w:val="20"/>
+        </w:rPr>
+        <w:t>Scope and Honesty Notice</w:t>
+        <w:br/>
+      </w:r>
+      <w:r>
+        <w:rPr>
+          <w:rFonts w:ascii="Calibri" w:hAnsi="Calibri"/>
+          <w:b w:val="0"/>
+          <w:i/>
+          <w:color w:val="1F497D"/>
+          <w:sz w:val="20"/>
+        </w:rPr>
+        <w:t>This document reflects where the intern research team currently stands. Vulnerabilities cited are drawn from confirmed MIRR project findings — the vulnerability assessment, stakeholder documents, and the APTIM evaluation memo — not from independent GIS analysis conducted by this team. GIS analysis has not yet been performed. Where that matters — where a claim is ours rather than the MIRR's — this document says so explicitly. Routes for further investigation are raised as questions, not recommendations.</w:t>
+      </w:r>
+    </w:p>
     <w:p>
       <w:pPr>
         <w:spacing w:before="280" w:after="80"/>
@@ -76,9 +108,9 @@
           <w:b/>
           <w:i w:val="0"/>
           <w:color w:val="1F497D"/>
-          <w:sz w:val="28"/>
+          <w:sz w:val="26"/>
         </w:rPr>
-        <w:t>1. Framing: Energy Risk Management, Not Efficiency Management</w:t>
+        <w:t>1. What the MIRR Has Already Confirmed</w:t>
       </w:r>
     </w:p>
     <w:p>
@@ -92,12 +124,27 @@
           <w:i w:val="0"/>
           <w:sz w:val="22"/>
         </w:rPr>
-        <w:t>The energy vulnerability findings confirmed through the MIRR vulnerability assessment are fundamentally an energy risk management problem, not an energy efficiency problem. The installations are not wasting power — they depend on a fragile supply chain that can be severed by a single hazard event. The MIRR's own bottom-line finding confirms this:</w:t>
+        <w:t>The following findings come directly from MIRR vulnerability assessment documents and are cited here as the established baseline — not as intern-generated conclusions.</w:t>
       </w:r>
     </w:p>
     <w:p>
       <w:pPr>
-        <w:spacing w:after="120"/>
+        <w:spacing w:before="160" w:after="80"/>
+      </w:pPr>
+      <w:r>
+        <w:rPr>
+          <w:rFonts w:ascii="Calibri" w:hAnsi="Calibri"/>
+          <w:b/>
+          <w:i w:val="0"/>
+          <w:color w:val="376092"/>
+          <w:sz w:val="22"/>
+        </w:rPr>
+        <w:t>1.1  The Bottom-Line Finding</w:t>
+      </w:r>
+    </w:p>
+    <w:p>
+      <w:pPr>
+        <w:spacing w:after="80"/>
         <w:ind w:left="576"/>
       </w:pPr>
       <w:r>
@@ -105,10 +152,21 @@
           <w:rFonts w:ascii="Calibri" w:hAnsi="Calibri"/>
           <w:b w:val="0"/>
           <w:i/>
-          <w:color w:val="595959"/>
+          <w:color w:val="404040"/>
           <w:sz w:val="22"/>
         </w:rPr>
-        <w:t>"No immediate risk to mission other than single points of failure at each installation.  — MIRR Vulnerability Assessment, January 2026 Steering Committee"</w:t>
+        <w:t>"At the asset systems level there is no immediate risk to mission other than single points of failure at each installation."</w:t>
+      </w:r>
+      <w:r>
+        <w:rPr>
+          <w:rFonts w:ascii="Calibri" w:hAnsi="Calibri"/>
+          <w:b w:val="0"/>
+          <w:i/>
+          <w:color w:val="7F7F7F"/>
+          <w:sz w:val="19"/>
+        </w:rPr>
+        <w:br/>
+        <w:t>— MIRR Vulnerability Assessment, January 2026 Steering Committee</w:t>
       </w:r>
     </w:p>
     <w:p>
@@ -122,7 +180,22 @@
           <w:i w:val="0"/>
           <w:sz w:val="22"/>
         </w:rPr>
-        <w:t>Energy efficiency measures — load reduction, LED upgrades, demand management — do not address single points of failure. The correct framework is energy supply risk management: ensuring continuity of supply under hazard conditions, reducing failure points, and shortening restoration timelines when failure occurs.</w:t>
+        <w:t>All four installations rely on a single electrical substation with no backup supply path. Utility IGSAs at NAS Jacksonville and NS Mayport cover operations and maintenance only — not resilience or redundancy. No formal resilience coordination exists between Camp Blanding and FPL.  (MIRR Mutual Support Assessment, February 2026 TAC)</w:t>
+      </w:r>
+    </w:p>
+    <w:p>
+      <w:pPr>
+        <w:spacing w:before="160" w:after="80"/>
+      </w:pPr>
+      <w:r>
+        <w:rPr>
+          <w:rFonts w:ascii="Calibri" w:hAnsi="Calibri"/>
+          <w:b/>
+          <w:i w:val="0"/>
+          <w:color w:val="376092"/>
+          <w:sz w:val="22"/>
+        </w:rPr>
+        <w:t>1.2  Confirmed Energy Risk Ratings</w:t>
       </w:r>
     </w:p>
     <w:p>
@@ -136,310 +209,7 @@
           <w:i w:val="0"/>
           <w:sz w:val="22"/>
         </w:rPr>
-        <w:t>A useful way to frame the long-term goal, drawn from intern team analysis: these installations currently function as isolated but dependent islands — drawing from the regional grid with no backup path. The adaptation objective is to shift them toward connected hubs capable of both offering and accepting support to and from the larger grid. This shift was made urgent by Hurricane Michael's 2018 impact on Tyndall Air Force Base, where on-base hardening proved insufficient when surrounding roads, utilities, and civilian infrastructure failed (APTIM memo, May 2026, Section 1.1; GAO-22-105452, 2021).</w:t>
-      </w:r>
-    </w:p>
-    <w:p>
-      <w:pPr>
-        <w:spacing w:before="280" w:after="80"/>
-      </w:pPr>
-      <w:r>
-        <w:rPr>
-          <w:rFonts w:ascii="Calibri" w:hAnsi="Calibri"/>
-          <w:b/>
-          <w:i w:val="0"/>
-          <w:color w:val="1F497D"/>
-          <w:sz w:val="28"/>
-        </w:rPr>
-        <w:t>2. The Cascade Mechanism: How Flooding Becomes an Energy Crisis</w:t>
-      </w:r>
-    </w:p>
-    <w:p>
-      <w:pPr>
-        <w:spacing w:after="120"/>
-      </w:pPr>
-      <w:r>
-        <w:rPr>
-          <w:rFonts w:ascii="Calibri" w:hAnsi="Calibri"/>
-          <w:b w:val="0"/>
-          <w:i w:val="0"/>
-          <w:sz w:val="22"/>
-        </w:rPr>
-        <w:t>Flooding does not threaten energy systems in isolation. It triggers a sequence of failures across interconnected infrastructure. For all four MIRR installations the cascade follows a common pattern:</w:t>
-      </w:r>
-    </w:p>
-    <w:p>
-      <w:pPr>
-        <w:pStyle w:val="ListBullet"/>
-        <w:spacing w:after="60"/>
-        <w:ind w:left="360"/>
-      </w:pPr>
-      <w:r>
-        <w:rPr>
-          <w:rFonts w:ascii="Calibri" w:hAnsi="Calibri"/>
-          <w:b w:val="0"/>
-          <w:i w:val="0"/>
-          <w:sz w:val="22"/>
-        </w:rPr>
-        <w:t>Hazard event — storm surge, compound rainfall flooding, or wildfire</w:t>
-      </w:r>
-    </w:p>
-    <w:p>
-      <w:pPr>
-        <w:pStyle w:val="ListBullet"/>
-        <w:spacing w:after="60"/>
-        <w:ind w:left="360"/>
-      </w:pPr>
-      <w:r>
-        <w:rPr>
-          <w:rFonts w:ascii="Calibri" w:hAnsi="Calibri"/>
-          <w:b w:val="0"/>
-          <w:i w:val="0"/>
-          <w:sz w:val="22"/>
-        </w:rPr>
-        <w:t>Transportation corridors flood or close:</w:t>
-        <w:br/>
-        <w:t xml:space="preserve">     A1A (NS Mayport)  |  Heckscher Drive (Blount Island)  |  Roosevelt Blvd / US-17 (NAS JAX)  |  SR-16 (Camp Blanding)</w:t>
-      </w:r>
-    </w:p>
-    <w:p>
-      <w:pPr>
-        <w:pStyle w:val="ListBullet"/>
-        <w:spacing w:after="60"/>
-        <w:ind w:left="360"/>
-      </w:pPr>
-      <w:r>
-        <w:rPr>
-          <w:rFonts w:ascii="Calibri" w:hAnsi="Calibri"/>
-          <w:b w:val="0"/>
-          <w:i w:val="0"/>
-          <w:sz w:val="22"/>
-        </w:rPr>
-        <w:t>Utility restoration crews cannot reach substations</w:t>
-      </w:r>
-    </w:p>
-    <w:p>
-      <w:pPr>
-        <w:pStyle w:val="ListBullet"/>
-        <w:spacing w:after="60"/>
-        <w:ind w:left="360"/>
-      </w:pPr>
-      <w:r>
-        <w:rPr>
-          <w:rFonts w:ascii="Calibri" w:hAnsi="Calibri"/>
-          <w:b w:val="0"/>
-          <w:i w:val="0"/>
-          <w:sz w:val="22"/>
-        </w:rPr>
-        <w:t>Substation damage cannot be repaired on a mission-critical timeline</w:t>
-      </w:r>
-    </w:p>
-    <w:p>
-      <w:pPr>
-        <w:pStyle w:val="ListBullet"/>
-        <w:spacing w:after="60"/>
-        <w:ind w:left="360"/>
-      </w:pPr>
-      <w:r>
-        <w:rPr>
-          <w:rFonts w:ascii="Calibri" w:hAnsi="Calibri"/>
-          <w:b w:val="0"/>
-          <w:i w:val="0"/>
-          <w:sz w:val="22"/>
-        </w:rPr>
-        <w:t>Backup generator fuel supply is depleted</w:t>
-      </w:r>
-    </w:p>
-    <w:p>
-      <w:pPr>
-        <w:pStyle w:val="ListBullet"/>
-        <w:spacing w:after="60"/>
-        <w:ind w:left="360"/>
-      </w:pPr>
-      <w:r>
-        <w:rPr>
-          <w:rFonts w:ascii="Calibri" w:hAnsi="Calibri"/>
-          <w:b w:val="0"/>
-          <w:i w:val="0"/>
-          <w:sz w:val="22"/>
-        </w:rPr>
-        <w:t>Mission-critical systems lose power → Mission disruption</w:t>
-      </w:r>
-    </w:p>
-    <w:p>
-      <w:pPr>
-        <w:spacing w:after="120"/>
-      </w:pPr>
-      <w:r>
-        <w:rPr>
-          <w:rFonts w:ascii="Calibri" w:hAnsi="Calibri"/>
-          <w:b w:val="0"/>
-          <w:i w:val="0"/>
-          <w:sz w:val="22"/>
-        </w:rPr>
-      </w:r>
-    </w:p>
-    <w:p>
-      <w:pPr>
-        <w:spacing w:after="60"/>
-      </w:pPr>
-      <w:r>
-        <w:rPr>
-          <w:rFonts w:ascii="Calibri" w:hAnsi="Calibri"/>
-          <w:b w:val="0"/>
-          <w:i w:val="0"/>
-          <w:sz w:val="22"/>
-        </w:rPr>
-        <w:t>Flooding compounds energy risk through additional mechanisms:</w:t>
-      </w:r>
-    </w:p>
-    <w:p>
-      <w:pPr>
-        <w:pStyle w:val="ListBullet"/>
-        <w:spacing w:after="80"/>
-      </w:pPr>
-      <w:r>
-        <w:rPr>
-          <w:rFonts w:ascii="Calibri" w:hAnsi="Calibri"/>
-          <w:b/>
-          <w:i w:val="0"/>
-          <w:sz w:val="22"/>
-        </w:rPr>
-        <w:t xml:space="preserve">Saltwater corrosion: </w:t>
-      </w:r>
-      <w:r>
-        <w:rPr>
-          <w:rFonts w:ascii="Calibri" w:hAnsi="Calibri"/>
-          <w:b w:val="0"/>
-          <w:i w:val="0"/>
-          <w:sz w:val="22"/>
-        </w:rPr>
-        <w:t>Storm surge deposits salt residue on substation equipment even when the facility is not fully inundated, accelerating equipment degradation and increasing future failure probability.</w:t>
-      </w:r>
-    </w:p>
-    <w:p>
-      <w:pPr>
-        <w:pStyle w:val="ListBullet"/>
-        <w:spacing w:after="80"/>
-      </w:pPr>
-      <w:r>
-        <w:rPr>
-          <w:rFonts w:ascii="Calibri" w:hAnsi="Calibri"/>
-          <w:b/>
-          <w:i w:val="0"/>
-          <w:sz w:val="22"/>
-        </w:rPr>
-        <w:t xml:space="preserve">Fuel delivery disruption: </w:t>
-      </w:r>
-      <w:r>
-        <w:rPr>
-          <w:rFonts w:ascii="Calibri" w:hAnsi="Calibri"/>
-          <w:b w:val="0"/>
-          <w:i w:val="0"/>
-          <w:sz w:val="22"/>
-        </w:rPr>
-        <w:t>Backup generator fuel is delivered by truck on the same flooded roads that block restoration crews. Extended outages can exhaust fuel before grid power is restored.</w:t>
-      </w:r>
-    </w:p>
-    <w:p>
-      <w:pPr>
-        <w:pStyle w:val="ListBullet"/>
-        <w:spacing w:after="80"/>
-      </w:pPr>
-      <w:r>
-        <w:rPr>
-          <w:rFonts w:ascii="Calibri" w:hAnsi="Calibri"/>
-          <w:b/>
-          <w:i w:val="0"/>
-          <w:sz w:val="22"/>
-        </w:rPr>
-        <w:t xml:space="preserve">Regional grid stress: </w:t>
-      </w:r>
-      <w:r>
-        <w:rPr>
-          <w:rFonts w:ascii="Calibri" w:hAnsi="Calibri"/>
-          <w:b w:val="0"/>
-          <w:i w:val="0"/>
-          <w:sz w:val="22"/>
-        </w:rPr>
-        <w:t>Large-scale flooding can knock out multiple JEA and FPL infrastructure nodes simultaneously, extending regional restoration timelines regardless of local conditions.</w:t>
-      </w:r>
-    </w:p>
-    <w:p>
-      <w:pPr>
-        <w:pStyle w:val="ListBullet"/>
-        <w:spacing w:after="80"/>
-      </w:pPr>
-      <w:r>
-        <w:rPr>
-          <w:rFonts w:ascii="Calibri" w:hAnsi="Calibri"/>
-          <w:b/>
-          <w:i w:val="0"/>
-          <w:sz w:val="22"/>
-        </w:rPr>
-        <w:t xml:space="preserve">Water supply contamination: </w:t>
-      </w:r>
-      <w:r>
-        <w:rPr>
-          <w:rFonts w:ascii="Calibri" w:hAnsi="Calibri"/>
-          <w:b w:val="0"/>
-          <w:i w:val="0"/>
-          <w:sz w:val="22"/>
-        </w:rPr>
-        <w:t>Flood events in coastal and industrial areas mobilize contaminants — particularly relevant near Blount Island and NAS Jacksonville, where fuel storage and legacy industrial activity create contamination risk when floodwaters intrude. This compounds the post-event recovery burden and poses personnel health and operational risks.</w:t>
-      </w:r>
-    </w:p>
-    <w:p>
-      <w:pPr>
-        <w:pStyle w:val="ListBullet"/>
-        <w:spacing w:after="80"/>
-      </w:pPr>
-      <w:r>
-        <w:rPr>
-          <w:rFonts w:ascii="Calibri" w:hAnsi="Calibri"/>
-          <w:b/>
-          <w:i w:val="0"/>
-          <w:sz w:val="22"/>
-        </w:rPr>
-        <w:t xml:space="preserve">US-17 transmission corridor (to investigate): </w:t>
-      </w:r>
-      <w:r>
-        <w:rPr>
-          <w:rFonts w:ascii="Calibri" w:hAnsi="Calibri"/>
-          <w:b w:val="0"/>
-          <w:i w:val="0"/>
-          <w:sz w:val="22"/>
-        </w:rPr>
-        <w:t>Early intern research identified substations and transmission lines along the US-17 highway corridor as common single points of failure across the region. GIS verification of which specific lines run along this corridor is needed before this is stated as a confirmed finding.</w:t>
-      </w:r>
-    </w:p>
-    <w:p>
-      <w:pPr>
-        <w:spacing w:before="280" w:after="80"/>
-      </w:pPr>
-      <w:r>
-        <w:rPr>
-          <w:rFonts w:ascii="Calibri" w:hAnsi="Calibri"/>
-          <w:b/>
-          <w:i w:val="0"/>
-          <w:color w:val="1F497D"/>
-          <w:sz w:val="28"/>
-        </w:rPr>
-        <w:t>3. Installation-Level Energy Risk Summary</w:t>
-      </w:r>
-    </w:p>
-    <w:p>
-      <w:pPr>
-        <w:spacing w:after="120"/>
-      </w:pPr>
-      <w:r>
-        <w:rPr>
-          <w:rFonts w:ascii="Calibri" w:hAnsi="Calibri"/>
-          <w:b w:val="0"/>
-          <w:i w:val="0"/>
-          <w:sz w:val="22"/>
-        </w:rPr>
-        <w:t>All four installations carry confirmed energy risk ratings from the January 2026 Steering Committee Vulnerability Assessment. All rely on a single electrical substation with no backup supply path. Utility IGSAs cover operations and maintenance only — not resilience or redundancy (MIRR Mutual Support Assessment, February 2026 TAC).</w:t>
+        <w:t>From the January 2026 Steering Committee vulnerability assessment table:</w:t>
       </w:r>
     </w:p>
     <w:tbl>
@@ -502,6 +272,7 @@
               <w:rPr>
                 <w:rFonts w:ascii="Calibri" w:hAnsi="Calibri"/>
                 <w:b/>
+                <w:i w:val="0"/>
                 <w:color w:val="FFFFFF"/>
                 <w:sz w:val="19"/>
               </w:rPr>
@@ -523,27 +294,7 @@
               <w:rPr>
                 <w:rFonts w:ascii="Calibri" w:hAnsi="Calibri"/>
                 <w:b/>
-                <w:color w:val="FFFFFF"/>
-                <w:sz w:val="19"/>
-              </w:rPr>
-              <w:t>Strategic Mission</w:t>
-            </w:r>
-          </w:p>
-        </w:tc>
-        <w:tc>
-          <w:tcPr>
-            <w:tcW w:type="dxa" w:w="1728"/>
-            <w:shd w:val="clear" w:color="auto" w:fill="1F497D"/>
-          </w:tcPr>
-          <w:p>
-            <w:pPr>
-              <w:spacing w:after="40"/>
-            </w:pPr>
-            <w:r/>
-            <w:r>
-              <w:rPr>
-                <w:rFonts w:ascii="Calibri" w:hAnsi="Calibri"/>
-                <w:b/>
+                <w:i w:val="0"/>
                 <w:color w:val="FFFFFF"/>
                 <w:sz w:val="19"/>
               </w:rPr>
@@ -565,10 +316,11 @@
               <w:rPr>
                 <w:rFonts w:ascii="Calibri" w:hAnsi="Calibri"/>
                 <w:b/>
+                <w:i w:val="0"/>
                 <w:color w:val="FFFFFF"/>
                 <w:sz w:val="19"/>
               </w:rPr>
-              <w:t>Risk / Urgency</w:t>
+              <w:t>Risk to Mission</w:t>
             </w:r>
           </w:p>
         </w:tc>
@@ -586,10 +338,33 @@
               <w:rPr>
                 <w:rFonts w:ascii="Calibri" w:hAnsi="Calibri"/>
                 <w:b/>
+                <w:i w:val="0"/>
                 <w:color w:val="FFFFFF"/>
                 <w:sz w:val="19"/>
               </w:rPr>
-              <w:t>Primary Cascade Trigger</w:t>
+              <w:t>Urgency</w:t>
+            </w:r>
+          </w:p>
+        </w:tc>
+        <w:tc>
+          <w:tcPr>
+            <w:tcW w:type="dxa" w:w="1728"/>
+            <w:shd w:val="clear" w:color="auto" w:fill="1F497D"/>
+          </w:tcPr>
+          <w:p>
+            <w:pPr>
+              <w:spacing w:after="40"/>
+            </w:pPr>
+            <w:r/>
+            <w:r>
+              <w:rPr>
+                <w:rFonts w:ascii="Calibri" w:hAnsi="Calibri"/>
+                <w:b/>
+                <w:i w:val="0"/>
+                <w:color w:val="FFFFFF"/>
+                <w:sz w:val="19"/>
+              </w:rPr>
+              <w:t>Confirmed Hazard Exposure</w:t>
             </w:r>
           </w:p>
         </w:tc>
@@ -608,6 +383,7 @@
               <w:rPr>
                 <w:rFonts w:ascii="Calibri" w:hAnsi="Calibri"/>
                 <w:b w:val="0"/>
+                <w:i w:val="0"/>
                 <w:sz w:val="19"/>
               </w:rPr>
               <w:t>NS Mayport</w:t>
@@ -627,25 +403,7 @@
               <w:rPr>
                 <w:rFonts w:ascii="Calibri" w:hAnsi="Calibri"/>
                 <w:b w:val="0"/>
-                <w:sz w:val="19"/>
-              </w:rPr>
-              <w:t>4th Fleet HQ; Atlantic operations</w:t>
-            </w:r>
-          </w:p>
-        </w:tc>
-        <w:tc>
-          <w:tcPr>
-            <w:tcW w:type="dxa" w:w="1728"/>
-          </w:tcPr>
-          <w:p>
-            <w:pPr>
-              <w:spacing w:after="40"/>
-            </w:pPr>
-            <w:r/>
-            <w:r>
-              <w:rPr>
-                <w:rFonts w:ascii="Calibri" w:hAnsi="Calibri"/>
-                <w:b w:val="0"/>
+                <w:i w:val="0"/>
                 <w:sz w:val="19"/>
               </w:rPr>
               <w:t>JEA Mayport Sub (south of base)</w:t>
@@ -665,9 +423,10 @@
               <w:rPr>
                 <w:rFonts w:ascii="Calibri" w:hAnsi="Calibri"/>
                 <w:b w:val="0"/>
+                <w:i w:val="0"/>
                 <w:sz w:val="19"/>
               </w:rPr>
-              <w:t>HIGH / Immediate</w:t>
+              <w:t>HIGH</w:t>
             </w:r>
           </w:p>
         </w:tc>
@@ -684,9 +443,30 @@
               <w:rPr>
                 <w:rFonts w:ascii="Calibri" w:hAnsi="Calibri"/>
                 <w:b w:val="0"/>
+                <w:i w:val="0"/>
                 <w:sz w:val="19"/>
               </w:rPr>
-              <w:t>A1A flooding blocks restoration crews</w:t>
+              <w:t>Immediate</w:t>
+            </w:r>
+          </w:p>
+        </w:tc>
+        <w:tc>
+          <w:tcPr>
+            <w:tcW w:type="dxa" w:w="1728"/>
+          </w:tcPr>
+          <w:p>
+            <w:pPr>
+              <w:spacing w:after="40"/>
+            </w:pPr>
+            <w:r/>
+            <w:r>
+              <w:rPr>
+                <w:rFonts w:ascii="Calibri" w:hAnsi="Calibri"/>
+                <w:b w:val="0"/>
+                <w:i w:val="0"/>
+                <w:sz w:val="19"/>
+              </w:rPr>
+              <w:t>Storm surge, rainfall flooding</w:t>
             </w:r>
           </w:p>
         </w:tc>
@@ -705,6 +485,109 @@
               <w:rPr>
                 <w:rFonts w:ascii="Calibri" w:hAnsi="Calibri"/>
                 <w:b w:val="0"/>
+                <w:i w:val="0"/>
+                <w:sz w:val="19"/>
+              </w:rPr>
+              <w:t>MCSF Blount Island</w:t>
+            </w:r>
+          </w:p>
+        </w:tc>
+        <w:tc>
+          <w:tcPr>
+            <w:tcW w:type="dxa" w:w="1728"/>
+          </w:tcPr>
+          <w:p>
+            <w:pPr>
+              <w:spacing w:after="40"/>
+            </w:pPr>
+            <w:r/>
+            <w:r>
+              <w:rPr>
+                <w:rFonts w:ascii="Calibri" w:hAnsi="Calibri"/>
+                <w:b w:val="0"/>
+                <w:i w:val="0"/>
+                <w:sz w:val="19"/>
+              </w:rPr>
+              <w:t>JEA Substation</w:t>
+            </w:r>
+          </w:p>
+        </w:tc>
+        <w:tc>
+          <w:tcPr>
+            <w:tcW w:type="dxa" w:w="1728"/>
+          </w:tcPr>
+          <w:p>
+            <w:pPr>
+              <w:spacing w:after="40"/>
+            </w:pPr>
+            <w:r/>
+            <w:r>
+              <w:rPr>
+                <w:rFonts w:ascii="Calibri" w:hAnsi="Calibri"/>
+                <w:b w:val="0"/>
+                <w:i w:val="0"/>
+                <w:sz w:val="19"/>
+              </w:rPr>
+              <w:t>MEDIUM</w:t>
+            </w:r>
+          </w:p>
+        </w:tc>
+        <w:tc>
+          <w:tcPr>
+            <w:tcW w:type="dxa" w:w="1728"/>
+          </w:tcPr>
+          <w:p>
+            <w:pPr>
+              <w:spacing w:after="40"/>
+            </w:pPr>
+            <w:r/>
+            <w:r>
+              <w:rPr>
+                <w:rFonts w:ascii="Calibri" w:hAnsi="Calibri"/>
+                <w:b w:val="0"/>
+                <w:i w:val="0"/>
+                <w:sz w:val="19"/>
+              </w:rPr>
+              <w:t>Immediate</w:t>
+            </w:r>
+          </w:p>
+        </w:tc>
+        <w:tc>
+          <w:tcPr>
+            <w:tcW w:type="dxa" w:w="1728"/>
+          </w:tcPr>
+          <w:p>
+            <w:pPr>
+              <w:spacing w:after="40"/>
+            </w:pPr>
+            <w:r/>
+            <w:r>
+              <w:rPr>
+                <w:rFonts w:ascii="Calibri" w:hAnsi="Calibri"/>
+                <w:b w:val="0"/>
+                <w:i w:val="0"/>
+                <w:sz w:val="19"/>
+              </w:rPr>
+              <w:t>Storm surge, shoreline loss, water intrusion already active</w:t>
+            </w:r>
+          </w:p>
+        </w:tc>
+      </w:tr>
+      <w:tr>
+        <w:tc>
+          <w:tcPr>
+            <w:tcW w:type="dxa" w:w="1728"/>
+          </w:tcPr>
+          <w:p>
+            <w:pPr>
+              <w:spacing w:after="40"/>
+            </w:pPr>
+            <w:r/>
+            <w:r>
+              <w:rPr>
+                <w:rFonts w:ascii="Calibri" w:hAnsi="Calibri"/>
+                <w:b w:val="0"/>
+                <w:i w:val="0"/>
                 <w:sz w:val="19"/>
               </w:rPr>
               <w:t>NAS Jacksonville</w:t>
@@ -724,9 +607,10 @@
               <w:rPr>
                 <w:rFonts w:ascii="Calibri" w:hAnsi="Calibri"/>
                 <w:b w:val="0"/>
+                <w:i w:val="0"/>
                 <w:sz w:val="19"/>
               </w:rPr>
-              <w:t>P-8 maritime patrol; logistics hub</w:t>
+              <w:t>JEA Sub (north of base)</w:t>
             </w:r>
           </w:p>
         </w:tc>
@@ -743,9 +627,10 @@
               <w:rPr>
                 <w:rFonts w:ascii="Calibri" w:hAnsi="Calibri"/>
                 <w:b w:val="0"/>
+                <w:i w:val="0"/>
                 <w:sz w:val="19"/>
               </w:rPr>
-              <w:t>JEA Sub (north of base) + TECO gas</w:t>
+              <w:t>MEDIUM</w:t>
             </w:r>
           </w:p>
         </w:tc>
@@ -762,9 +647,10 @@
               <w:rPr>
                 <w:rFonts w:ascii="Calibri" w:hAnsi="Calibri"/>
                 <w:b w:val="0"/>
+                <w:i w:val="0"/>
                 <w:sz w:val="19"/>
               </w:rPr>
-              <w:t>MEDIUM / Immediate</w:t>
+              <w:t>Immediate</w:t>
             </w:r>
           </w:p>
         </w:tc>
@@ -781,9 +667,10 @@
               <w:rPr>
                 <w:rFonts w:ascii="Calibri" w:hAnsi="Calibri"/>
                 <w:b w:val="0"/>
+                <w:i w:val="0"/>
                 <w:sz w:val="19"/>
               </w:rPr>
-              <w:t>Roosevelt Blvd / US-17 flooding</w:t>
+              <w:t>Lack of redundancy; TECO gas as second SPOF</w:t>
             </w:r>
           </w:p>
         </w:tc>
@@ -802,103 +689,7 @@
               <w:rPr>
                 <w:rFonts w:ascii="Calibri" w:hAnsi="Calibri"/>
                 <w:b w:val="0"/>
-                <w:sz w:val="19"/>
-              </w:rPr>
-              <w:t>MCSF Blount Island</w:t>
-            </w:r>
-          </w:p>
-        </w:tc>
-        <w:tc>
-          <w:tcPr>
-            <w:tcW w:type="dxa" w:w="1728"/>
-          </w:tcPr>
-          <w:p>
-            <w:pPr>
-              <w:spacing w:after="40"/>
-            </w:pPr>
-            <w:r/>
-            <w:r>
-              <w:rPr>
-                <w:rFonts w:ascii="Calibri" w:hAnsi="Calibri"/>
-                <w:b w:val="0"/>
-                <w:sz w:val="19"/>
-              </w:rPr>
-              <w:t>Marine Corps 72-hr prepositioning</w:t>
-            </w:r>
-          </w:p>
-        </w:tc>
-        <w:tc>
-          <w:tcPr>
-            <w:tcW w:type="dxa" w:w="1728"/>
-          </w:tcPr>
-          <w:p>
-            <w:pPr>
-              <w:spacing w:after="40"/>
-            </w:pPr>
-            <w:r/>
-            <w:r>
-              <w:rPr>
-                <w:rFonts w:ascii="Calibri" w:hAnsi="Calibri"/>
-                <w:b w:val="0"/>
-                <w:sz w:val="19"/>
-              </w:rPr>
-              <w:t>JEA Sub</w:t>
-            </w:r>
-          </w:p>
-        </w:tc>
-        <w:tc>
-          <w:tcPr>
-            <w:tcW w:type="dxa" w:w="1728"/>
-          </w:tcPr>
-          <w:p>
-            <w:pPr>
-              <w:spacing w:after="40"/>
-            </w:pPr>
-            <w:r/>
-            <w:r>
-              <w:rPr>
-                <w:rFonts w:ascii="Calibri" w:hAnsi="Calibri"/>
-                <w:b w:val="0"/>
-                <w:sz w:val="19"/>
-              </w:rPr>
-              <w:t>MEDIUM / Immediate</w:t>
-            </w:r>
-          </w:p>
-        </w:tc>
-        <w:tc>
-          <w:tcPr>
-            <w:tcW w:type="dxa" w:w="1728"/>
-          </w:tcPr>
-          <w:p>
-            <w:pPr>
-              <w:spacing w:after="40"/>
-            </w:pPr>
-            <w:r/>
-            <w:r>
-              <w:rPr>
-                <w:rFonts w:ascii="Calibri" w:hAnsi="Calibri"/>
-                <w:b w:val="0"/>
-                <w:sz w:val="19"/>
-              </w:rPr>
-              <w:t>Heckscher Drive closure</w:t>
-            </w:r>
-          </w:p>
-        </w:tc>
-      </w:tr>
-      <w:tr>
-        <w:tc>
-          <w:tcPr>
-            <w:tcW w:type="dxa" w:w="1728"/>
-          </w:tcPr>
-          <w:p>
-            <w:pPr>
-              <w:spacing w:after="40"/>
-            </w:pPr>
-            <w:r/>
-            <w:r>
-              <w:rPr>
-                <w:rFonts w:ascii="Calibri" w:hAnsi="Calibri"/>
-                <w:b w:val="0"/>
+                <w:i w:val="0"/>
                 <w:sz w:val="19"/>
               </w:rPr>
               <w:t>Camp Blanding</w:t>
@@ -918,25 +709,7 @@
               <w:rPr>
                 <w:rFonts w:ascii="Calibri" w:hAnsi="Calibri"/>
                 <w:b w:val="0"/>
-                <w:sz w:val="19"/>
-              </w:rPr>
-              <w:t>National Guard mobilization</w:t>
-            </w:r>
-          </w:p>
-        </w:tc>
-        <w:tc>
-          <w:tcPr>
-            <w:tcW w:type="dxa" w:w="1728"/>
-          </w:tcPr>
-          <w:p>
-            <w:pPr>
-              <w:spacing w:after="40"/>
-            </w:pPr>
-            <w:r/>
-            <w:r>
-              <w:rPr>
-                <w:rFonts w:ascii="Calibri" w:hAnsi="Calibri"/>
-                <w:b w:val="0"/>
+                <w:i w:val="0"/>
                 <w:sz w:val="19"/>
               </w:rPr>
               <w:t>FPL Sub (north of base)</w:t>
@@ -956,9 +729,10 @@
               <w:rPr>
                 <w:rFonts w:ascii="Calibri" w:hAnsi="Calibri"/>
                 <w:b w:val="0"/>
+                <w:i w:val="0"/>
                 <w:sz w:val="19"/>
               </w:rPr>
-              <w:t>HIGH / Near-Term</w:t>
+              <w:t>HIGH</w:t>
             </w:r>
           </w:p>
         </w:tc>
@@ -975,15 +749,163 @@
               <w:rPr>
                 <w:rFonts w:ascii="Calibri" w:hAnsi="Calibri"/>
                 <w:b w:val="0"/>
+                <w:i w:val="0"/>
                 <w:sz w:val="19"/>
               </w:rPr>
-              <w:t>SR-16 flooding + wildfire on transmission corridor</w:t>
+              <w:t>Near-Term</w:t>
+            </w:r>
+          </w:p>
+        </w:tc>
+        <w:tc>
+          <w:tcPr>
+            <w:tcW w:type="dxa" w:w="1728"/>
+          </w:tcPr>
+          <w:p>
+            <w:pPr>
+              <w:spacing w:after="40"/>
+            </w:pPr>
+            <w:r/>
+            <w:r>
+              <w:rPr>
+                <w:rFonts w:ascii="Calibri" w:hAnsi="Calibri"/>
+                <w:b w:val="0"/>
+                <w:i w:val="0"/>
+                <w:sz w:val="19"/>
+              </w:rPr>
+              <w:t>Lack of redundancy, wildfire on transmission corridor</w:t>
             </w:r>
           </w:p>
         </w:tc>
       </w:tr>
     </w:tbl>
     <w:p/>
+    <w:p>
+      <w:pPr>
+        <w:spacing w:after="100"/>
+        <w:ind w:left="432"/>
+      </w:pPr>
+      <w:r>
+        <w:rPr>
+          <w:rFonts w:ascii="Calibri" w:hAnsi="Calibri"/>
+          <w:b w:val="0"/>
+          <w:i/>
+          <w:color w:val="595959"/>
+          <w:sz w:val="22"/>
+        </w:rPr>
+        <w:t>Note: GIS would visualize these confirmed ratings spatially — overlaying substation locations against SLOSH surge zones, CDBG flood models, and USDA wildfire data. That analysis has not yet been performed by this team.</w:t>
+      </w:r>
+    </w:p>
+    <w:p>
+      <w:pPr>
+        <w:spacing w:before="160" w:after="80"/>
+      </w:pPr>
+      <w:r>
+        <w:rPr>
+          <w:rFonts w:ascii="Calibri" w:hAnsi="Calibri"/>
+          <w:b/>
+          <w:i w:val="0"/>
+          <w:color w:val="376092"/>
+          <w:sz w:val="22"/>
+        </w:rPr>
+        <w:t>1.3  Additional Confirmed Vulnerabilities from MIRR Documents</w:t>
+      </w:r>
+    </w:p>
+    <w:p>
+      <w:pPr>
+        <w:pStyle w:val="ListBullet"/>
+        <w:spacing w:after="80"/>
+      </w:pPr>
+      <w:r>
+        <w:rPr>
+          <w:rFonts w:ascii="Calibri" w:hAnsi="Calibri"/>
+          <w:b/>
+          <w:i w:val="0"/>
+          <w:sz w:val="22"/>
+        </w:rPr>
+        <w:t xml:space="preserve">Water intrusion already threatening electrical systems at Blount Island — </w:t>
+      </w:r>
+      <w:r>
+        <w:rPr>
+          <w:rFonts w:ascii="Calibri" w:hAnsi="Calibri"/>
+          <w:b w:val="0"/>
+          <w:i w:val="0"/>
+          <w:sz w:val="22"/>
+        </w:rPr>
+        <w:t>confirmed in the MCSF Blount Island Kickoff Briefing (April 2025). This is a current degradation, not a future scenario.</w:t>
+      </w:r>
+    </w:p>
+    <w:p>
+      <w:pPr>
+        <w:pStyle w:val="ListBullet"/>
+        <w:spacing w:after="80"/>
+      </w:pPr>
+      <w:r>
+        <w:rPr>
+          <w:rFonts w:ascii="Calibri" w:hAnsi="Calibri"/>
+          <w:b/>
+          <w:i w:val="0"/>
+          <w:sz w:val="22"/>
+        </w:rPr>
+        <w:t xml:space="preserve">Camp Blanding depends on four separate power providers plus Seminole Electric — </w:t>
+      </w:r>
+      <w:r>
+        <w:rPr>
+          <w:rFonts w:ascii="Calibri" w:hAnsi="Calibri"/>
+          <w:b w:val="0"/>
+          <w:i w:val="0"/>
+          <w:sz w:val="22"/>
+        </w:rPr>
+        <w:t>confirmed in the Camp Blanding Summary V2. This creates a coordination complexity that is itself a vulnerability independent of physical hazard exposure.</w:t>
+      </w:r>
+    </w:p>
+    <w:p>
+      <w:pPr>
+        <w:pStyle w:val="ListBullet"/>
+        <w:spacing w:after="80"/>
+      </w:pPr>
+      <w:r>
+        <w:rPr>
+          <w:rFonts w:ascii="Calibri" w:hAnsi="Calibri"/>
+          <w:b/>
+          <w:i w:val="0"/>
+          <w:sz w:val="22"/>
+        </w:rPr>
+        <w:t xml:space="preserve">JEA has initiated grid hardening and a microgrid feasibility study at NAS Jacksonville — </w:t>
+      </w:r>
+      <w:r>
+        <w:rPr>
+          <w:rFonts w:ascii="Calibri" w:hAnsi="Calibri"/>
+          <w:b w:val="0"/>
+          <w:i w:val="0"/>
+          <w:sz w:val="22"/>
+        </w:rPr>
+        <w:t>confirmed in the NAS JAX Summary V3. This is an existing effort, not a proposed action.</w:t>
+      </w:r>
+    </w:p>
+    <w:p>
+      <w:pPr>
+        <w:pStyle w:val="ListBullet"/>
+        <w:spacing w:after="80"/>
+      </w:pPr>
+      <w:r>
+        <w:rPr>
+          <w:rFonts w:ascii="Calibri" w:hAnsi="Calibri"/>
+          <w:b/>
+          <w:i w:val="0"/>
+          <w:sz w:val="22"/>
+        </w:rPr>
+        <w:t xml:space="preserve">P035 Dual Fuel Generator Project at Blount Island is ERCIP-funded and in Final Design — </w:t>
+      </w:r>
+      <w:r>
+        <w:rPr>
+          <w:rFonts w:ascii="Calibri" w:hAnsi="Calibri"/>
+          <w:b w:val="0"/>
+          <w:i w:val="0"/>
+          <w:sz w:val="22"/>
+        </w:rPr>
+        <w:t>confirmed in the MCSF Blount Island Kickoff Briefing. Construction has not yet begun.</w:t>
+      </w:r>
+    </w:p>
     <w:p>
       <w:pPr>
         <w:spacing w:before="280" w:after="80"/>
@@ -994,9 +916,9 @@
           <w:b/>
           <w:i w:val="0"/>
           <w:color w:val="1F497D"/>
-          <w:sz w:val="28"/>
+          <w:sz w:val="26"/>
         </w:rPr>
-        <w:t>4. Adaptation Strategies</w:t>
+        <w:t>2. How We Are Framing This Problem</w:t>
       </w:r>
     </w:p>
     <w:p>
@@ -1010,316 +932,7 @@
           <w:i w:val="0"/>
           <w:sz w:val="22"/>
         </w:rPr>
-        <w:t>The APTIM evaluation framework (May 2026, Section 3.2) scores four strategy types — Protect, Accommodate, Avoidance/Relocation, and Regional Collaboration — on operational value, implementation feasibility, and long-term durability. Regional Collaboration scores highest for long-term durability across all utility and infrastructure scenarios.</w:t>
-      </w:r>
-    </w:p>
-    <w:p>
-      <w:pPr>
-        <w:spacing w:before="160" w:after="80"/>
-      </w:pPr>
-      <w:r>
-        <w:rPr>
-          <w:rFonts w:ascii="Calibri" w:hAnsi="Calibri"/>
-          <w:b/>
-          <w:i w:val="0"/>
-          <w:color w:val="376092"/>
-          <w:sz w:val="24"/>
-        </w:rPr>
-        <w:t>4.1  Near-Term Strategies (0–5 Years)</w:t>
-      </w:r>
-    </w:p>
-    <w:p>
-      <w:pPr>
-        <w:pStyle w:val="ListBullet"/>
-        <w:spacing w:after="100"/>
-      </w:pPr>
-      <w:r>
-        <w:rPr>
-          <w:rFonts w:ascii="Calibri" w:hAnsi="Calibri"/>
-          <w:b/>
-          <w:i w:val="0"/>
-          <w:sz w:val="22"/>
-        </w:rPr>
-        <w:t xml:space="preserve">IGSA Expansion (Regional Collaboration — highest leverage): </w:t>
-      </w:r>
-      <w:r>
-        <w:rPr>
-          <w:rFonts w:ascii="Calibri" w:hAnsi="Calibri"/>
-          <w:b w:val="0"/>
-          <w:i w:val="0"/>
-          <w:sz w:val="22"/>
-        </w:rPr>
-        <w:t>Expand JEA IGSAs at NAS JAX and NS Mayport to include resilience and redundancy provisions, not only O&amp;M. Administrative action requiring no capital. Directly addresses the confirmed mutual support gap. Establish baseline FPL coordination for Camp Blanding. (MIRR Regional Recommendation R-2)</w:t>
-      </w:r>
-    </w:p>
-    <w:p>
-      <w:pPr>
-        <w:pStyle w:val="ListBullet"/>
-        <w:spacing w:after="100"/>
-      </w:pPr>
-      <w:r>
-        <w:rPr>
-          <w:rFonts w:ascii="Calibri" w:hAnsi="Calibri"/>
-          <w:b/>
-          <w:i w:val="0"/>
-          <w:sz w:val="22"/>
-        </w:rPr>
-        <w:t xml:space="preserve">Substation Hardening at NS Mayport (Protect): </w:t>
-      </w:r>
-      <w:r>
-        <w:rPr>
-          <w:rFonts w:ascii="Calibri" w:hAnsi="Calibri"/>
-          <w:b w:val="0"/>
-          <w:i w:val="0"/>
-          <w:sz w:val="22"/>
-        </w:rPr>
-        <w:t>Flood barrier deployment or dry-type transformer installation at the JEA Mayport Substation — the highest-urgency energy risk in the region (HIGH / Immediate). Coordinated with JEA under the expanded IGSA. Flood-proofing substations may provide greater mission continuity per dollar than large-scale shoreline measures (APTIM, Section 3.2).</w:t>
-      </w:r>
-    </w:p>
-    <w:p>
-      <w:pPr>
-        <w:pStyle w:val="ListBullet"/>
-        <w:spacing w:after="100"/>
-      </w:pPr>
-      <w:r>
-        <w:rPr>
-          <w:rFonts w:ascii="Calibri" w:hAnsi="Calibri"/>
-          <w:b/>
-          <w:i w:val="0"/>
-          <w:sz w:val="22"/>
-        </w:rPr>
-        <w:t xml:space="preserve">P035 Dual Fuel Generator Project at Blount Island (Accommodate / Protect): </w:t>
-      </w:r>
-      <w:r>
-        <w:rPr>
-          <w:rFonts w:ascii="Calibri" w:hAnsi="Calibri"/>
-          <w:b w:val="0"/>
-          <w:i w:val="0"/>
-          <w:sz w:val="22"/>
-        </w:rPr>
-        <w:t>ERCIP-funded project in Final Design Authority. Installs generators in all nine critical facilities, reducing JEA grid dependency. Priority: reach construction without delay.</w:t>
-      </w:r>
-    </w:p>
-    <w:p>
-      <w:pPr>
-        <w:pStyle w:val="ListBullet"/>
-        <w:spacing w:after="100"/>
-      </w:pPr>
-      <w:r>
-        <w:rPr>
-          <w:rFonts w:ascii="Calibri" w:hAnsi="Calibri"/>
-          <w:b/>
-          <w:i w:val="0"/>
-          <w:sz w:val="22"/>
-        </w:rPr>
-        <w:t xml:space="preserve">JEA Microgrid Feasibility → Funded Project at NAS JAX (Accommodate): </w:t>
-      </w:r>
-      <w:r>
-        <w:rPr>
-          <w:rFonts w:ascii="Calibri" w:hAnsi="Calibri"/>
-          <w:b w:val="0"/>
-          <w:i w:val="0"/>
-          <w:sz w:val="22"/>
-        </w:rPr>
-        <w:t>JEA's in-progress microgrid feasibility study should be accelerated toward a funded implementation via ERCIP or ESPC, providing islanding capability for Tier 1 loads.</w:t>
-      </w:r>
-    </w:p>
-    <w:p>
-      <w:pPr>
-        <w:pStyle w:val="ListBullet"/>
-        <w:spacing w:after="100"/>
-      </w:pPr>
-      <w:r>
-        <w:rPr>
-          <w:rFonts w:ascii="Calibri" w:hAnsi="Calibri"/>
-          <w:b/>
-          <w:i w:val="0"/>
-          <w:sz w:val="22"/>
-        </w:rPr>
-        <w:t xml:space="preserve">Wildfire Fuel Management at Camp Blanding (Protect): </w:t>
-      </w:r>
-      <w:r>
-        <w:rPr>
-          <w:rFonts w:ascii="Calibri" w:hAnsi="Calibri"/>
-          <w:b w:val="0"/>
-          <w:i w:val="0"/>
-          <w:sz w:val="22"/>
-        </w:rPr>
-        <w:t>Prescribed fire programs already in place at Blanding should explicitly include the FPL transmission corridor as an objective, reducing wildfire SPOF risk.</w:t>
-      </w:r>
-    </w:p>
-    <w:p>
-      <w:pPr>
-        <w:pStyle w:val="ListBullet"/>
-        <w:spacing w:after="100"/>
-      </w:pPr>
-      <w:r>
-        <w:rPr>
-          <w:rFonts w:ascii="Calibri" w:hAnsi="Calibri"/>
-          <w:b/>
-          <w:i w:val="0"/>
-          <w:sz w:val="22"/>
-        </w:rPr>
-        <w:t xml:space="preserve">Formalize Mutual Support Agreements (Regional Collaboration): </w:t>
-      </w:r>
-      <w:r>
-        <w:rPr>
-          <w:rFonts w:ascii="Calibri" w:hAnsi="Calibri"/>
-          <w:b w:val="0"/>
-          <w:i w:val="0"/>
-          <w:sz w:val="22"/>
-        </w:rPr>
-        <w:t>Existing informal coordination between installations and utilities should be formalized through MSAs that define restoration priorities, data sharing, and resilience obligations — building on the IGSA expansion and extending to emergency scenarios.</w:t>
-      </w:r>
-    </w:p>
-    <w:p>
-      <w:pPr>
-        <w:spacing w:before="160" w:after="80"/>
-      </w:pPr>
-      <w:r>
-        <w:rPr>
-          <w:rFonts w:ascii="Calibri" w:hAnsi="Calibri"/>
-          <w:b/>
-          <w:i w:val="0"/>
-          <w:color w:val="376092"/>
-          <w:sz w:val="24"/>
-        </w:rPr>
-        <w:t>4.2  Long-Term Strategies (5–20 Years)</w:t>
-      </w:r>
-    </w:p>
-    <w:p>
-      <w:pPr>
-        <w:pStyle w:val="ListBullet"/>
-        <w:spacing w:after="100"/>
-      </w:pPr>
-      <w:r>
-        <w:rPr>
-          <w:rFonts w:ascii="Calibri" w:hAnsi="Calibri"/>
-          <w:b/>
-          <w:i w:val="0"/>
-          <w:sz w:val="22"/>
-        </w:rPr>
-        <w:t xml:space="preserve">Regional Utility Coordination Framework (Regional Collaboration): </w:t>
-      </w:r>
-      <w:r>
-        <w:rPr>
-          <w:rFonts w:ascii="Calibri" w:hAnsi="Calibri"/>
-          <w:b w:val="0"/>
-          <w:i w:val="0"/>
-          <w:sz w:val="22"/>
-        </w:rPr>
-        <w:t>Convene JEA, FPL, Seminole Electric, CCUA, and TECO under a formal resilience MOU enabling coordinated capital investment tied to installation vulnerability timelines. This is the structural solution to civilian infrastructure dependency across all four installations.</w:t>
-      </w:r>
-    </w:p>
-    <w:p>
-      <w:pPr>
-        <w:pStyle w:val="ListBullet"/>
-        <w:spacing w:after="100"/>
-      </w:pPr>
-      <w:r>
-        <w:rPr>
-          <w:rFonts w:ascii="Calibri" w:hAnsi="Calibri"/>
-          <w:b/>
-          <w:i w:val="0"/>
-          <w:sz w:val="22"/>
-        </w:rPr>
-        <w:t xml:space="preserve">Dedicated Redundant Feed at NAS JAX (Avoidance/Relocation): </w:t>
-      </w:r>
-      <w:r>
-        <w:rPr>
-          <w:rFonts w:ascii="Calibri" w:hAnsi="Calibri"/>
-          <w:b w:val="0"/>
-          <w:i w:val="0"/>
-          <w:sz w:val="22"/>
-        </w:rPr>
-        <w:t>A redundant transmission feed from a diverse grid injection point — informed by the JEA microgrid study — would permanently decouple mission-critical loads from civilian distribution vulnerabilities.</w:t>
-      </w:r>
-    </w:p>
-    <w:p>
-      <w:pPr>
-        <w:pStyle w:val="ListBullet"/>
-        <w:spacing w:after="100"/>
-      </w:pPr>
-      <w:r>
-        <w:rPr>
-          <w:rFonts w:ascii="Calibri" w:hAnsi="Calibri"/>
-          <w:b/>
-          <w:i w:val="0"/>
-          <w:sz w:val="22"/>
-        </w:rPr>
-        <w:t xml:space="preserve">Shoreline Resilience as Energy Co-Benefit at Mayport and Blount Island (Protect): </w:t>
-      </w:r>
-      <w:r>
-        <w:rPr>
-          <w:rFonts w:ascii="Calibri" w:hAnsi="Calibri"/>
-          <w:b w:val="0"/>
-          <w:i w:val="0"/>
-          <w:sz w:val="22"/>
-        </w:rPr>
-        <w:t>Seawall adaptation, living shorelines, and berms protecting substation access corridors directly reduce the storm surge inundation pathway to energy infrastructure — energy resilience embedded in coastal projects already scoped in the MIRR.</w:t>
-      </w:r>
-    </w:p>
-    <w:p>
-      <w:pPr>
-        <w:pStyle w:val="ListBullet"/>
-        <w:spacing w:after="100"/>
-      </w:pPr>
-      <w:r>
-        <w:rPr>
-          <w:rFonts w:ascii="Calibri" w:hAnsi="Calibri"/>
-          <w:b/>
-          <w:i w:val="0"/>
-          <w:sz w:val="22"/>
-        </w:rPr>
-        <w:t xml:space="preserve">EUL Solar + BESS at Camp Blanding (Avoidance/Relocation): </w:t>
-      </w:r>
-      <w:r>
-        <w:rPr>
-          <w:rFonts w:ascii="Calibri" w:hAnsi="Calibri"/>
-          <w:b w:val="0"/>
-          <w:i w:val="0"/>
-          <w:sz w:val="22"/>
-        </w:rPr>
-        <w:t>73,000 acres and rural land availability position Blanding for utility-scale solar under Enhanced Use Lease authority, paired with battery storage. Substantially reduces dependence on the wildfire-exposed FPL corridor. Solar PV and battery storage costs have declined significantly in recent years, improving feasibility relative to prior assessments.</w:t>
-      </w:r>
-    </w:p>
-    <w:p>
-      <w:pPr>
-        <w:pStyle w:val="ListBullet"/>
-        <w:spacing w:after="100"/>
-      </w:pPr>
-      <w:r>
-        <w:rPr>
-          <w:rFonts w:ascii="Calibri" w:hAnsi="Calibri"/>
-          <w:b/>
-          <w:i w:val="0"/>
-          <w:sz w:val="22"/>
-        </w:rPr>
-        <w:t xml:space="preserve">Expanded Monitoring and Data Collection (Accommodate — long-term): </w:t>
-      </w:r>
-      <w:r>
-        <w:rPr>
-          <w:rFonts w:ascii="Calibri" w:hAnsi="Calibri"/>
-          <w:b w:val="0"/>
-          <w:i w:val="0"/>
-          <w:sz w:val="22"/>
-        </w:rPr>
-        <w:t>Expand grid monitoring systems and data collection infrastructure to better predict outages, track restoration performance, and measure the effectiveness of adaptation investments over time. Performance data — outage duration, restoration time, backup duration — should be reviewed periodically with utilities and installation representatives as part of the MIRR implementation framework (APTIM, Section 5.1). This is also identified by the intern team's prior research as a key long-term enabler.</w:t>
-      </w:r>
-    </w:p>
-    <w:p>
-      <w:pPr>
-        <w:spacing w:before="280" w:after="80"/>
-      </w:pPr>
-      <w:r>
-        <w:rPr>
-          <w:rFonts w:ascii="Calibri" w:hAnsi="Calibri"/>
-          <w:b/>
-          <w:i w:val="0"/>
-          <w:color w:val="1F497D"/>
-          <w:sz w:val="28"/>
-        </w:rPr>
-        <w:t>5. Areas to Explore Further</w:t>
+        <w:t>Based on reviewing the MIRR documents and the APTIM evaluation memo, the intern team identifies this as an energy risk management problem — not an energy efficiency problem. The installations are not wasting power. The supply chain delivering that power is fragile. Efficiency measures reduce consumption; they do not change the fact that a single substation failure cuts power to the entire installation.</w:t>
       </w:r>
     </w:p>
     <w:p>
@@ -1333,22 +946,38 @@
           <w:i w:val="0"/>
           <w:sz w:val="22"/>
         </w:rPr>
-        <w:t>The following are raised as opportunities warranting further study. They are clearly labeled as exploratory — not confirmed recommendations — because source verification or GIS analysis is still needed.</w:t>
+        <w:t>A useful frame drawn from the intern team's review: these installations currently function as isolated but dependent islands — drawing from the regional grid with no backup path. The APTIM memo (May 2026, Section 1.1) and the Hurricane Michael / Tyndall AFB experience both point toward the same long-term direction: installations need to become connected hubs capable of both drawing from and contributing to the regional grid. That framing shapes the investigation routes in Section 4.</w:t>
       </w:r>
     </w:p>
     <w:p>
       <w:pPr>
-        <w:spacing w:before="160" w:after="80"/>
+        <w:spacing w:after="100"/>
+        <w:ind w:left="432"/>
+      </w:pPr>
+      <w:r>
+        <w:rPr>
+          <w:rFonts w:ascii="Calibri" w:hAnsi="Calibri"/>
+          <w:b w:val="0"/>
+          <w:i/>
+          <w:color w:val="595959"/>
+          <w:sz w:val="22"/>
+        </w:rPr>
+        <w:t>Note: This framing is the intern team's analytical observation based on document review. It is not a MIRR-confirmed finding and has not been tested against GIS or operational data.</w:t>
+      </w:r>
+    </w:p>
+    <w:p>
+      <w:pPr>
+        <w:spacing w:before="280" w:after="80"/>
       </w:pPr>
       <w:r>
         <w:rPr>
           <w:rFonts w:ascii="Calibri" w:hAnsi="Calibri"/>
           <w:b/>
           <w:i w:val="0"/>
-          <w:color w:val="376092"/>
-          <w:sz w:val="24"/>
+          <w:color w:val="1F497D"/>
+          <w:sz w:val="26"/>
         </w:rPr>
-        <w:t>5.1  Tidal and River Current Energy — NS Mayport and MCSF Blount Island</w:t>
+        <w:t>3. The Cascade: How Flooding Becomes an Energy Crisis</w:t>
       </w:r>
     </w:p>
     <w:p>
@@ -1362,7 +991,257 @@
           <w:i w:val="0"/>
           <w:sz w:val="22"/>
         </w:rPr>
-        <w:t>The St. Johns River mouth at Naval Station Mayport has one of the highest tidal flow rates in Florida (~4–5 ft tidal range). Tidal energy converters — underwater turbines that harvest kinetic energy from river current — are submerged below storm surge exposure and generate power on predictable tidal cycles, independent of wind or solar conditions. For installations facing the flood-transportation-energy cascade, generation that does not depend on road access for routine operation has structural appeal.</w:t>
+        <w:t>The following cascade is a logical analysis built on the confirmed MIRR findings above. It is not an independent finding — it connects dots that the MIRR documents already confirm individually. GIS analysis would test and quantify each link in this chain.</w:t>
+      </w:r>
+    </w:p>
+    <w:p>
+      <w:pPr>
+        <w:spacing w:after="60"/>
+        <w:ind w:left="432"/>
+      </w:pPr>
+      <w:r>
+        <w:rPr>
+          <w:rFonts w:ascii="Calibri" w:hAnsi="Calibri"/>
+          <w:b/>
+          <w:i w:val="0"/>
+          <w:sz w:val="22"/>
+        </w:rPr>
+        <w:t xml:space="preserve">Step 1:  </w:t>
+      </w:r>
+      <w:r>
+        <w:rPr>
+          <w:rFonts w:ascii="Calibri" w:hAnsi="Calibri"/>
+          <w:b w:val="0"/>
+          <w:i w:val="0"/>
+          <w:sz w:val="22"/>
+        </w:rPr>
+        <w:t>Hazard event occurs — storm surge, compound rainfall flooding, or wildfire</w:t>
+      </w:r>
+    </w:p>
+    <w:p>
+      <w:pPr>
+        <w:spacing w:after="60"/>
+        <w:ind w:left="432"/>
+      </w:pPr>
+      <w:r>
+        <w:rPr>
+          <w:rFonts w:ascii="Calibri" w:hAnsi="Calibri"/>
+          <w:b/>
+          <w:i w:val="0"/>
+          <w:sz w:val="22"/>
+        </w:rPr>
+        <w:t xml:space="preserve">Step 2:  </w:t>
+      </w:r>
+      <w:r>
+        <w:rPr>
+          <w:rFonts w:ascii="Calibri" w:hAnsi="Calibri"/>
+          <w:b w:val="0"/>
+          <w:i w:val="0"/>
+          <w:sz w:val="22"/>
+        </w:rPr>
+        <w:t>Transportation corridors flood or close:</w:t>
+        <w:br/>
+        <w:t xml:space="preserve">     A1A (NS Mayport)  |  Heckscher Drive (Blount Island)  |  Roosevelt Blvd / US-17 (NAS JAX)  |  SR-16 (Camp Blanding)</w:t>
+        <w:br/>
+        <w:t xml:space="preserve">     [All confirmed as transportation SPOFs in MIRR VA, Jan 2026 SC]</w:t>
+      </w:r>
+    </w:p>
+    <w:p>
+      <w:pPr>
+        <w:spacing w:after="60"/>
+        <w:ind w:left="432"/>
+      </w:pPr>
+      <w:r>
+        <w:rPr>
+          <w:rFonts w:ascii="Calibri" w:hAnsi="Calibri"/>
+          <w:b/>
+          <w:i w:val="0"/>
+          <w:sz w:val="22"/>
+        </w:rPr>
+        <w:t xml:space="preserve">Step 3:  </w:t>
+      </w:r>
+      <w:r>
+        <w:rPr>
+          <w:rFonts w:ascii="Calibri" w:hAnsi="Calibri"/>
+          <w:b w:val="0"/>
+          <w:i w:val="0"/>
+          <w:sz w:val="22"/>
+        </w:rPr>
+        <w:t>Utility restoration crews cannot reach the affected substation</w:t>
+      </w:r>
+    </w:p>
+    <w:p>
+      <w:pPr>
+        <w:spacing w:after="60"/>
+        <w:ind w:left="432"/>
+      </w:pPr>
+      <w:r>
+        <w:rPr>
+          <w:rFonts w:ascii="Calibri" w:hAnsi="Calibri"/>
+          <w:b/>
+          <w:i w:val="0"/>
+          <w:sz w:val="22"/>
+        </w:rPr>
+        <w:t xml:space="preserve">Step 4:  </w:t>
+      </w:r>
+      <w:r>
+        <w:rPr>
+          <w:rFonts w:ascii="Calibri" w:hAnsi="Calibri"/>
+          <w:b w:val="0"/>
+          <w:i w:val="0"/>
+          <w:sz w:val="22"/>
+        </w:rPr>
+        <w:t>Substation damage cannot be repaired — outage duration extends beyond what backup systems can cover</w:t>
+      </w:r>
+    </w:p>
+    <w:p>
+      <w:pPr>
+        <w:spacing w:after="60"/>
+        <w:ind w:left="432"/>
+      </w:pPr>
+      <w:r>
+        <w:rPr>
+          <w:rFonts w:ascii="Calibri" w:hAnsi="Calibri"/>
+          <w:b/>
+          <w:i w:val="0"/>
+          <w:sz w:val="22"/>
+        </w:rPr>
+        <w:t xml:space="preserve">Step 5:  </w:t>
+      </w:r>
+      <w:r>
+        <w:rPr>
+          <w:rFonts w:ascii="Calibri" w:hAnsi="Calibri"/>
+          <w:b w:val="0"/>
+          <w:i w:val="0"/>
+          <w:sz w:val="22"/>
+        </w:rPr>
+        <w:t>Mission-critical systems lose power — mission disruption follows</w:t>
+      </w:r>
+    </w:p>
+    <w:p/>
+    <w:p>
+      <w:pPr>
+        <w:spacing w:after="120"/>
+      </w:pPr>
+      <w:r>
+        <w:rPr>
+          <w:rFonts w:ascii="Calibri" w:hAnsi="Calibri"/>
+          <w:b w:val="0"/>
+          <w:i w:val="0"/>
+          <w:sz w:val="22"/>
+        </w:rPr>
+        <w:t>Additional mechanisms that the MIRR documents suggest but that need further investigation:</w:t>
+      </w:r>
+    </w:p>
+    <w:p>
+      <w:pPr>
+        <w:pStyle w:val="ListBullet"/>
+        <w:spacing w:after="80"/>
+      </w:pPr>
+      <w:r>
+        <w:rPr>
+          <w:rFonts w:ascii="Calibri" w:hAnsi="Calibri"/>
+          <w:b/>
+          <w:i w:val="0"/>
+          <w:sz w:val="22"/>
+        </w:rPr>
+        <w:t xml:space="preserve">Saltwater corrosion: </w:t>
+      </w:r>
+      <w:r>
+        <w:rPr>
+          <w:rFonts w:ascii="Calibri" w:hAnsi="Calibri"/>
+          <w:b w:val="0"/>
+          <w:i w:val="0"/>
+          <w:sz w:val="22"/>
+        </w:rPr>
+        <w:t>Storm surge deposits salt residue on substation equipment even without full inundation, accelerating long-term degradation. Relevant to NS Mayport and Blount Island. Not yet spatially analyzed by this team.</w:t>
+      </w:r>
+    </w:p>
+    <w:p>
+      <w:pPr>
+        <w:pStyle w:val="ListBullet"/>
+        <w:spacing w:after="80"/>
+      </w:pPr>
+      <w:r>
+        <w:rPr>
+          <w:rFonts w:ascii="Calibri" w:hAnsi="Calibri"/>
+          <w:b/>
+          <w:i w:val="0"/>
+          <w:sz w:val="22"/>
+        </w:rPr>
+        <w:t xml:space="preserve">Fuel delivery disruption: </w:t>
+      </w:r>
+      <w:r>
+        <w:rPr>
+          <w:rFonts w:ascii="Calibri" w:hAnsi="Calibri"/>
+          <w:b w:val="0"/>
+          <w:i w:val="0"/>
+          <w:sz w:val="22"/>
+        </w:rPr>
+        <w:t>Backup generator fuel is delivered by truck on the same corridors that block restoration crews. Duration of flooding relative to generator fuel capacity has not been assessed.</w:t>
+      </w:r>
+    </w:p>
+    <w:p>
+      <w:pPr>
+        <w:pStyle w:val="ListBullet"/>
+        <w:spacing w:after="80"/>
+      </w:pPr>
+      <w:r>
+        <w:rPr>
+          <w:rFonts w:ascii="Calibri" w:hAnsi="Calibri"/>
+          <w:b/>
+          <w:i w:val="0"/>
+          <w:sz w:val="22"/>
+        </w:rPr>
+        <w:t xml:space="preserve">Water supply contamination: </w:t>
+      </w:r>
+      <w:r>
+        <w:rPr>
+          <w:rFonts w:ascii="Calibri" w:hAnsi="Calibri"/>
+          <w:b w:val="0"/>
+          <w:i w:val="0"/>
+          <w:sz w:val="22"/>
+        </w:rPr>
+        <w:t>Flooding in coastal and industrial areas can mobilize contaminants. The proximity of legacy industrial land uses near Blount Island and NAS JAX makes this worth investigating. No GIS overlay of contamination sites vs. flood zones has been done yet.</w:t>
+      </w:r>
+    </w:p>
+    <w:p>
+      <w:pPr>
+        <w:pStyle w:val="ListBullet"/>
+        <w:spacing w:after="80"/>
+      </w:pPr>
+      <w:r>
+        <w:rPr>
+          <w:rFonts w:ascii="Calibri" w:hAnsi="Calibri"/>
+          <w:b/>
+          <w:i w:val="0"/>
+          <w:sz w:val="22"/>
+        </w:rPr>
+        <w:t xml:space="preserve">US-17 transmission corridor (unverified): </w:t>
+      </w:r>
+      <w:r>
+        <w:rPr>
+          <w:rFonts w:ascii="Calibri" w:hAnsi="Calibri"/>
+          <w:b w:val="0"/>
+          <w:i w:val="0"/>
+          <w:sz w:val="22"/>
+        </w:rPr>
+        <w:t>The intern team's prior research flagged transmission lines along US-17 as a common regional SPOF. This has not been verified through GIS or utility data. It is raised as a question, not a confirmed finding.</w:t>
+      </w:r>
+    </w:p>
+    <w:p>
+      <w:pPr>
+        <w:spacing w:before="280" w:after="80"/>
+      </w:pPr>
+      <w:r>
+        <w:rPr>
+          <w:rFonts w:ascii="Calibri" w:hAnsi="Calibri"/>
+          <w:b/>
+          <w:i w:val="0"/>
+          <w:color w:val="1F497D"/>
+          <w:sz w:val="26"/>
+        </w:rPr>
+        <w:t>4. Why This Matters: Mission-Critical Context</w:t>
       </w:r>
     </w:p>
     <w:p>
@@ -1376,7 +1255,181 @@
           <w:i w:val="0"/>
           <w:sz w:val="22"/>
         </w:rPr>
-        <w:t>Constraints that must be honestly evaluated before any recommendation:</w:t>
+        <w:t>The following is contextual background drawn from publicly available information about each installation's mission. It is included to help frame the severity of the cascade risk identified above — not as operational intelligence or classified findings.</w:t>
+      </w:r>
+    </w:p>
+    <w:p>
+      <w:pPr>
+        <w:spacing w:before="160" w:after="80"/>
+      </w:pPr>
+      <w:r>
+        <w:rPr>
+          <w:rFonts w:ascii="Calibri" w:hAnsi="Calibri"/>
+          <w:b/>
+          <w:i w:val="0"/>
+          <w:color w:val="376092"/>
+          <w:sz w:val="22"/>
+        </w:rPr>
+        <w:t>NS Mayport — 4th Fleet Headquarters</w:t>
+      </w:r>
+    </w:p>
+    <w:p>
+      <w:pPr>
+        <w:spacing w:after="120"/>
+      </w:pPr>
+      <w:r>
+        <w:rPr>
+          <w:rFonts w:ascii="Calibri" w:hAnsi="Calibri"/>
+          <w:b w:val="0"/>
+          <w:i w:val="0"/>
+          <w:sz w:val="22"/>
+        </w:rPr>
+        <w:t>Home of the U.S. Navy's 4th Fleet, commanding operations across the Caribbean, Central America, and South America. Shore power to docked vessels, fueling operations, and command communications all depend on the JEA Mayport Substation — the highest-urgency confirmed SPOF in the region. The cascade risk here is direct: if the substation fails and A1A floods, those functions are on backup power with a finite fuel window.</w:t>
+      </w:r>
+    </w:p>
+    <w:p>
+      <w:pPr>
+        <w:spacing w:before="160" w:after="80"/>
+      </w:pPr>
+      <w:r>
+        <w:rPr>
+          <w:rFonts w:ascii="Calibri" w:hAnsi="Calibri"/>
+          <w:b/>
+          <w:i w:val="0"/>
+          <w:color w:val="376092"/>
+          <w:sz w:val="22"/>
+        </w:rPr>
+        <w:t>NAS Jacksonville — Maritime Patrol Hub</w:t>
+      </w:r>
+    </w:p>
+    <w:p>
+      <w:pPr>
+        <w:spacing w:after="120"/>
+      </w:pPr>
+      <w:r>
+        <w:rPr>
+          <w:rFonts w:ascii="Calibri" w:hAnsi="Calibri"/>
+          <w:b w:val="0"/>
+          <w:i w:val="0"/>
+          <w:sz w:val="22"/>
+        </w:rPr>
+        <w:t>Primary East Coast hub for P-8 Poseidon maritime patrol aircraft. Aircraft maintenance, fueling, and pre-flight systems require continuous power. NAS JAX also has a second confirmed SPOF — the TECO privatized natural gas system — which is independent of the JEA electrical grid and not captured in the substation analysis.</w:t>
+      </w:r>
+    </w:p>
+    <w:p>
+      <w:pPr>
+        <w:spacing w:before="160" w:after="80"/>
+      </w:pPr>
+      <w:r>
+        <w:rPr>
+          <w:rFonts w:ascii="Calibri" w:hAnsi="Calibri"/>
+          <w:b/>
+          <w:i w:val="0"/>
+          <w:color w:val="376092"/>
+          <w:sz w:val="22"/>
+        </w:rPr>
+        <w:t>MCSF Blount Island — Maritime Prepositioning Force</w:t>
+      </w:r>
+    </w:p>
+    <w:p>
+      <w:pPr>
+        <w:spacing w:after="120"/>
+      </w:pPr>
+      <w:r>
+        <w:rPr>
+          <w:rFonts w:ascii="Calibri" w:hAnsi="Calibri"/>
+          <w:b w:val="0"/>
+          <w:i w:val="0"/>
+          <w:sz w:val="22"/>
+        </w:rPr>
+        <w:t>Prepositioned Marine Corps equipment — vehicles, weapons systems, supplies — ready to deploy globally within 72 hours. Crane and conveyor operations, climate-controlled equipment storage, and logistics coordination all require continuous power. Water intrusion is already active at this site. A power outage here delays deployment capability — a consequence that scales with outage duration.</w:t>
+      </w:r>
+    </w:p>
+    <w:p>
+      <w:pPr>
+        <w:spacing w:before="160" w:after="80"/>
+      </w:pPr>
+      <w:r>
+        <w:rPr>
+          <w:rFonts w:ascii="Calibri" w:hAnsi="Calibri"/>
+          <w:b/>
+          <w:i w:val="0"/>
+          <w:color w:val="376092"/>
+          <w:sz w:val="22"/>
+        </w:rPr>
+        <w:t>Camp Blanding — National Guard Mobilization Hub</w:t>
+      </w:r>
+    </w:p>
+    <w:p>
+      <w:pPr>
+        <w:spacing w:after="120"/>
+      </w:pPr>
+      <w:r>
+        <w:rPr>
+          <w:rFonts w:ascii="Calibri" w:hAnsi="Calibri"/>
+          <w:b w:val="0"/>
+          <w:i w:val="0"/>
+          <w:sz w:val="22"/>
+        </w:rPr>
+        <w:t>Florida's primary National Guard training and mobilization center. Four-provider coordination complexity is confirmed. A wildfire cutting the FPL transmission corridor could disrupt power without any weather warning, during a mobilization event, with limited pre-event preparation time.</w:t>
+      </w:r>
+    </w:p>
+    <w:p>
+      <w:pPr>
+        <w:spacing w:before="280" w:after="80"/>
+      </w:pPr>
+      <w:r>
+        <w:rPr>
+          <w:rFonts w:ascii="Calibri" w:hAnsi="Calibri"/>
+          <w:b/>
+          <w:i w:val="0"/>
+          <w:color w:val="1F497D"/>
+          <w:sz w:val="26"/>
+        </w:rPr>
+        <w:t>5. Routes Worth Investigating</w:t>
+      </w:r>
+    </w:p>
+    <w:p>
+      <w:pPr>
+        <w:spacing w:after="120"/>
+      </w:pPr>
+      <w:r>
+        <w:rPr>
+          <w:rFonts w:ascii="Calibri" w:hAnsi="Calibri"/>
+          <w:b w:val="0"/>
+          <w:i w:val="0"/>
+          <w:sz w:val="22"/>
+        </w:rPr>
+        <w:t>These are questions and avenues the intern team believes are worth pursuing — not proposed solutions. Each is grounded in something the MIRR documents raise or imply, but none has been verified through GIS or independent data collection yet.</w:t>
+      </w:r>
+    </w:p>
+    <w:p>
+      <w:pPr>
+        <w:spacing w:before="160" w:after="80"/>
+      </w:pPr>
+      <w:r>
+        <w:rPr>
+          <w:rFonts w:ascii="Calibri" w:hAnsi="Calibri"/>
+          <w:b/>
+          <w:i w:val="0"/>
+          <w:color w:val="376092"/>
+          <w:sz w:val="22"/>
+        </w:rPr>
+        <w:t>5.1  Spatial Verification of the Cascade Chain</w:t>
+      </w:r>
+    </w:p>
+    <w:p>
+      <w:pPr>
+        <w:spacing w:after="120"/>
+      </w:pPr>
+      <w:r>
+        <w:rPr>
+          <w:rFonts w:ascii="Calibri" w:hAnsi="Calibri"/>
+          <w:b w:val="0"/>
+          <w:i w:val="0"/>
+          <w:sz w:val="22"/>
+        </w:rPr>
+        <w:t>The cascade described in Section 3 needs GIS to move from logical to verified:</w:t>
       </w:r>
     </w:p>
     <w:p>
@@ -1392,7 +1445,7 @@
           <w:i w:val="0"/>
           <w:sz w:val="22"/>
         </w:rPr>
-        <w:t>Navigation channel conflicts — Mayport Ferry and military vessel traffic use the river mouth</w:t>
+        <w:t>Do the confirmed transportation SPOFs (A1A, Heckscher Drive, Roosevelt Blvd, SR-16) actually intersect with the SLOSH Cat 3/5 or CDBG flood zones? By how much, and at what storm frequency?</w:t>
       </w:r>
     </w:p>
     <w:p>
@@ -1408,7 +1461,7 @@
           <w:i w:val="0"/>
           <w:sz w:val="22"/>
         </w:rPr>
-        <w:t>Environmental permitting — manatee, fish passage, and St. Johns River ecology</w:t>
+        <w:t>Are the confirmed substations within those same flood zones? What is their elevation relative to modeled surge and rainfall flood depths?</w:t>
       </w:r>
     </w:p>
     <w:p>
@@ -1424,7 +1477,66 @@
           <w:i w:val="0"/>
           <w:sz w:val="22"/>
         </w:rPr>
-        <w:t>Saltwater maintenance demands and long-term equipment durability</w:t>
+        <w:t>Are the US-17 transmission lines a confirmed regional SPOF, or is this an assumption from the intern team's prior research that needs verification?</w:t>
+      </w:r>
+    </w:p>
+    <w:p>
+      <w:pPr>
+        <w:spacing w:after="100"/>
+        <w:ind w:left="432"/>
+      </w:pPr>
+      <w:r>
+        <w:rPr>
+          <w:rFonts w:ascii="Calibri" w:hAnsi="Calibri"/>
+          <w:b w:val="0"/>
+          <w:i/>
+          <w:color w:val="595959"/>
+          <w:sz w:val="22"/>
+        </w:rPr>
+        <w:t>Note: Datasets that would answer these: HIFLD substations, NHC SLOSH, NEFRC CDBG flood model, EIA transmission lines, FDOT road network. All are in the confirmed MIRR dataset inventory.</w:t>
+      </w:r>
+    </w:p>
+    <w:p>
+      <w:pPr>
+        <w:spacing w:before="160" w:after="80"/>
+      </w:pPr>
+      <w:r>
+        <w:rPr>
+          <w:rFonts w:ascii="Calibri" w:hAnsi="Calibri"/>
+          <w:b/>
+          <w:i w:val="0"/>
+          <w:color w:val="376092"/>
+          <w:sz w:val="22"/>
+        </w:rPr>
+        <w:t>5.2  Tidal and River Current Energy — Is It Worth a Feasibility Study?</w:t>
+      </w:r>
+    </w:p>
+    <w:p>
+      <w:pPr>
+        <w:spacing w:after="120"/>
+      </w:pPr>
+      <w:r>
+        <w:rPr>
+          <w:rFonts w:ascii="Calibri" w:hAnsi="Calibri"/>
+          <w:b w:val="0"/>
+          <w:i w:val="0"/>
+          <w:sz w:val="22"/>
+        </w:rPr>
+        <w:t>The St. Johns River mouth at NS Mayport has one of the highest tidal flow rates in Florida. Tidal energy converters sit below storm surge and generate on predictable cycles. This is not in the MIRR documents or the APTIM memo — it is an avenue the intern team identified as potentially relevant given the installation's location.</w:t>
+      </w:r>
+    </w:p>
+    <w:p>
+      <w:pPr>
+        <w:spacing w:after="120"/>
+      </w:pPr>
+      <w:r>
+        <w:rPr>
+          <w:rFonts w:ascii="Calibri" w:hAnsi="Calibri"/>
+          <w:b w:val="0"/>
+          <w:i w:val="0"/>
+          <w:sz w:val="22"/>
+        </w:rPr>
+        <w:t>Questions that would need to be answered before this goes further:</w:t>
       </w:r>
     </w:p>
     <w:p>
@@ -1440,7 +1552,7 @@
           <w:i w:val="0"/>
           <w:sz w:val="22"/>
         </w:rPr>
-        <w:t>Capital cost and regulatory timeline for a technology not yet deployed at this location</w:t>
+        <w:t>Has the DOE Water Power Technologies Office or ESTCP already commissioned a feasibility study for tidal generation at Mayport or Blount Island?</w:t>
       </w:r>
     </w:p>
     <w:p>
@@ -1456,79 +1568,7 @@
           <w:i w:val="0"/>
           <w:sz w:val="22"/>
         </w:rPr>
-        <w:t>Whether a DOE Water Power Technologies Office feasibility study has been commissioned for this site (not documented in current MIRR materials — a data gap)</w:t>
-      </w:r>
-    </w:p>
-    <w:p>
-      <w:pPr>
-        <w:spacing w:before="160" w:after="80"/>
-      </w:pPr>
-      <w:r>
-        <w:rPr>
-          <w:rFonts w:ascii="Calibri" w:hAnsi="Calibri"/>
-          <w:b/>
-          <w:i w:val="0"/>
-          <w:color w:val="376092"/>
-          <w:sz w:val="24"/>
-        </w:rPr>
-        <w:t>5.2  Solar PV + Battery Storage — Camp Blanding</w:t>
-      </w:r>
-    </w:p>
-    <w:p>
-      <w:pPr>
-        <w:spacing w:after="120"/>
-      </w:pPr>
-      <w:r>
-        <w:rPr>
-          <w:rFonts w:ascii="Calibri" w:hAnsi="Calibri"/>
-          <w:b w:val="0"/>
-          <w:i w:val="0"/>
-          <w:sz w:val="22"/>
-        </w:rPr>
-        <w:t>Camp Blanding's 73,000 acres and rural land availability support utility-scale solar under Enhanced Use Lease (EUL) authority, paired with battery energy storage systems (BESS). This would reduce dependence on the FPL distribution corridor and its wildfire exposure. Prices for both solar PV and battery storage have declined significantly in recent years — identified by the intern team's prior research as an area warranting a current feasibility study scoped to Blanding's load profile.</w:t>
-      </w:r>
-    </w:p>
-    <w:p>
-      <w:pPr>
-        <w:spacing w:before="160" w:after="80"/>
-      </w:pPr>
-      <w:r>
-        <w:rPr>
-          <w:rFonts w:ascii="Calibri" w:hAnsi="Calibri"/>
-          <w:b/>
-          <w:i w:val="0"/>
-          <w:color w:val="376092"/>
-          <w:sz w:val="24"/>
-        </w:rPr>
-        <w:t>5.3  Landfill Methane and Alternative Generation — Area for Investigation</w:t>
-      </w:r>
-    </w:p>
-    <w:p>
-      <w:pPr>
-        <w:spacing w:after="120"/>
-      </w:pPr>
-      <w:r>
-        <w:rPr>
-          <w:rFonts w:ascii="Calibri" w:hAnsi="Calibri"/>
-          <w:b w:val="0"/>
-          <w:i w:val="0"/>
-          <w:sz w:val="22"/>
-        </w:rPr>
-        <w:t>The intern team's prior research flagged that Marine Corps Air Station Miramar (California) uses a blend of energy sources and battery storage to achieve extended islanded operation. Methane gas from landfills is noted as a significant energy source at that installation. The Jacksonville region has several landfill sites in proximity to NAS Jacksonville and Blount Island.</w:t>
-      </w:r>
-    </w:p>
-    <w:p>
-      <w:pPr>
-        <w:spacing w:after="120"/>
-      </w:pPr>
-      <w:r>
-        <w:rPr>
-          <w:rFonts w:ascii="Calibri" w:hAnsi="Calibri"/>
-          <w:b w:val="0"/>
-          <w:i w:val="0"/>
-          <w:sz w:val="22"/>
-        </w:rPr>
-        <w:t>Important caveat: the APTIM memo (May 2026, Section 1.2) confirms only that Miramar has "microgrid and energy resilience investments" (citing DOE 2022). The specific 21-day islanding duration and landfill methane details cited in the intern team's prior research have not been independently verified against a primary source. Before drawing a direct comparison to Northeast Florida, the following is needed:</w:t>
+        <w:t>Do navigation channel requirements for the Mayport Ferry and military vessels rule out submerged turbines in the river mouth?</w:t>
       </w:r>
     </w:p>
     <w:p>
@@ -1544,7 +1584,66 @@
           <w:i w:val="0"/>
           <w:sz w:val="22"/>
         </w:rPr>
-        <w:t>Primary source verification of the Miramar islanding duration and fuel sourcing</w:t>
+        <w:t>What are the environmental permitting requirements for manatee and fish passage in the St. Johns River?</w:t>
+      </w:r>
+    </w:p>
+    <w:p>
+      <w:pPr>
+        <w:spacing w:after="100"/>
+        <w:ind w:left="432"/>
+      </w:pPr>
+      <w:r>
+        <w:rPr>
+          <w:rFonts w:ascii="Calibri" w:hAnsi="Calibri"/>
+          <w:b w:val="0"/>
+          <w:i/>
+          <w:color w:val="595959"/>
+          <w:sz w:val="22"/>
+        </w:rPr>
+        <w:t>Note: This cannot move beyond a question until a site-specific feasibility review is done. It is raised here because it is an option not mentioned in the APTIM memo and the location makes it worth asking about.</w:t>
+      </w:r>
+    </w:p>
+    <w:p>
+      <w:pPr>
+        <w:spacing w:before="160" w:after="80"/>
+      </w:pPr>
+      <w:r>
+        <w:rPr>
+          <w:rFonts w:ascii="Calibri" w:hAnsi="Calibri"/>
+          <w:b/>
+          <w:i w:val="0"/>
+          <w:color w:val="376092"/>
+          <w:sz w:val="22"/>
+        </w:rPr>
+        <w:t>5.3  Landfill Methane as an Alternative Generation Source</w:t>
+      </w:r>
+    </w:p>
+    <w:p>
+      <w:pPr>
+        <w:spacing w:after="120"/>
+      </w:pPr>
+      <w:r>
+        <w:rPr>
+          <w:rFonts w:ascii="Calibri" w:hAnsi="Calibri"/>
+          <w:b w:val="0"/>
+          <w:i w:val="0"/>
+          <w:sz w:val="22"/>
+        </w:rPr>
+        <w:t>The intern team's prior research flagged that MCAS Miramar (California) uses a blend of energy sources including landfill methane to support extended islanded operations. The Jacksonville region has multiple landfill sites in proximity to NAS Jacksonville and Blount Island.</w:t>
+      </w:r>
+    </w:p>
+    <w:p>
+      <w:pPr>
+        <w:spacing w:after="120"/>
+      </w:pPr>
+      <w:r>
+        <w:rPr>
+          <w:rFonts w:ascii="Calibri" w:hAnsi="Calibri"/>
+          <w:b w:val="0"/>
+          <w:i w:val="0"/>
+          <w:sz w:val="22"/>
+        </w:rPr>
+        <w:t>Two things need to happen before this moves beyond a question:</w:t>
       </w:r>
     </w:p>
     <w:p>
@@ -1560,7 +1659,7 @@
           <w:i w:val="0"/>
           <w:sz w:val="22"/>
         </w:rPr>
-        <w:t>GIS mapping of Jacksonville-area landfill locations relative to NAS JAX and Blount Island</w:t>
+        <w:t>Source verification: the specific Miramar islanding duration and landfill methane details cited in the intern team's prior research have not been confirmed against a primary source. The APTIM memo only confirms that Miramar has 'microgrid and energy resilience investments' (Section 1.2, citing DOE 2022) — it does not mention landfill methane.</w:t>
       </w:r>
     </w:p>
     <w:p>
@@ -1576,36 +1675,38 @@
           <w:i w:val="0"/>
           <w:sz w:val="22"/>
         </w:rPr>
-        <w:t>Assessment of pipeline feasibility, permitting, and methane capture volumes</w:t>
+        <w:t>GIS mapping: proximity of Jacksonville-area landfills to the installations, and whether pipeline routing would be feasible, has not been assessed.</w:t>
       </w:r>
     </w:p>
     <w:p>
       <w:pPr>
-        <w:spacing w:after="120"/>
+        <w:spacing w:after="100"/>
+        <w:ind w:left="432"/>
       </w:pPr>
       <w:r>
         <w:rPr>
           <w:rFonts w:ascii="Calibri" w:hAnsi="Calibri"/>
           <w:b w:val="0"/>
           <w:i/>
+          <w:color w:val="595959"/>
           <w:sz w:val="22"/>
         </w:rPr>
-        <w:t>This is a legitimate area to explore — the physics and the regional geography make it worth investigating — but it should not be presented as a confirmed strategy until the source is verified.</w:t>
+        <w:t>Note: This is an honest area of uncertainty. It is worth verifying the source and mapping the geography before deciding whether to pursue it further.</w:t>
       </w:r>
     </w:p>
     <w:p>
       <w:pPr>
-        <w:spacing w:before="280" w:after="80"/>
+        <w:spacing w:before="160" w:after="80"/>
       </w:pPr>
       <w:r>
         <w:rPr>
           <w:rFonts w:ascii="Calibri" w:hAnsi="Calibri"/>
           <w:b/>
           <w:i w:val="0"/>
-          <w:color w:val="1F497D"/>
-          <w:sz w:val="28"/>
+          <w:color w:val="376092"/>
+          <w:sz w:val="22"/>
         </w:rPr>
-        <w:t>6. The Strategic Vulnerability: Civilian Infrastructure Dependency</w:t>
+        <w:t>5.4  Solar PV and Battery Storage at Camp Blanding</w:t>
       </w:r>
     </w:p>
     <w:p>
@@ -1619,7 +1720,21 @@
           <w:i w:val="0"/>
           <w:sz w:val="22"/>
         </w:rPr>
-        <w:t>All four installations depend on substations that are:</w:t>
+        <w:t>Camp Blanding's 73,000 acres and rural land availability raise the question of whether utility-scale solar under Enhanced Use Lease authority, paired with battery storage, could reduce dependence on the FPL transmission corridor. Solar PV and battery storage costs have declined significantly in recent years — noted in the intern team's prior research as a factor that may have changed the feasibility of options not previously considered viable.</w:t>
+      </w:r>
+    </w:p>
+    <w:p>
+      <w:pPr>
+        <w:spacing w:after="120"/>
+      </w:pPr>
+      <w:r>
+        <w:rPr>
+          <w:rFonts w:ascii="Calibri" w:hAnsi="Calibri"/>
+          <w:b w:val="0"/>
+          <w:i w:val="0"/>
+          <w:sz w:val="22"/>
+        </w:rPr>
+        <w:t>What would need to be assessed:</w:t>
       </w:r>
     </w:p>
     <w:p>
@@ -1635,7 +1750,7 @@
           <w:i w:val="0"/>
           <w:sz w:val="22"/>
         </w:rPr>
-        <w:t>Located outside the installation fence on civilian utility property</w:t>
+        <w:t>Has a solar feasibility study been commissioned at Camp Blanding under ESTCP or ESPC?</w:t>
       </w:r>
     </w:p>
     <w:p>
@@ -1651,7 +1766,7 @@
           <w:i w:val="0"/>
           <w:sz w:val="22"/>
         </w:rPr>
-        <w:t>Hardened to commercial utility standards, not military resilience standards</w:t>
+        <w:t>What portion of Blanding's load could realistically be offset by on-site generation?</w:t>
       </w:r>
     </w:p>
     <w:p>
@@ -1667,7 +1782,36 @@
           <w:i w:val="0"/>
           <w:sz w:val="22"/>
         </w:rPr>
-        <w:t>Publicly mapped in open federal databases (HIFLD Open)</w:t>
+        <w:t>Does the four-provider coordination structure complicate or simplify an EUL solar arrangement?</w:t>
+      </w:r>
+    </w:p>
+    <w:p>
+      <w:pPr>
+        <w:spacing w:before="160" w:after="80"/>
+      </w:pPr>
+      <w:r>
+        <w:rPr>
+          <w:rFonts w:ascii="Calibri" w:hAnsi="Calibri"/>
+          <w:b/>
+          <w:i w:val="0"/>
+          <w:color w:val="376092"/>
+          <w:sz w:val="22"/>
+        </w:rPr>
+        <w:t>5.5  Civilian Infrastructure Dependency — How Deep Is the Gap?</w:t>
+      </w:r>
+    </w:p>
+    <w:p>
+      <w:pPr>
+        <w:spacing w:after="120"/>
+      </w:pPr>
+      <w:r>
+        <w:rPr>
+          <w:rFonts w:ascii="Calibri" w:hAnsi="Calibri"/>
+          <w:b w:val="0"/>
+          <w:i w:val="0"/>
+          <w:sz w:val="22"/>
+        </w:rPr>
+        <w:t>All four installations depend on civilian-owned substations with no formal resilience obligation under current IGSAs. The MIRR has confirmed this gap. What is not yet known:</w:t>
       </w:r>
     </w:p>
     <w:p>
@@ -1683,7 +1827,70 @@
           <w:i w:val="0"/>
           <w:sz w:val="22"/>
         </w:rPr>
-        <w:t>Subject to no formal resilience obligation — current IGSAs cover O&amp;M only</w:t>
+        <w:t>What are the actual utility restoration timelines JEA and FPL commit to for comparable major outage events — and how do those compare to mission-critical power restoration requirements at each installation?</w:t>
+      </w:r>
+    </w:p>
+    <w:p>
+      <w:pPr>
+        <w:pStyle w:val="ListBullet"/>
+        <w:spacing w:after="60"/>
+        <w:ind w:left="360"/>
+      </w:pPr>
+      <w:r>
+        <w:rPr>
+          <w:rFonts w:ascii="Calibri" w:hAnsi="Calibri"/>
+          <w:b w:val="0"/>
+          <w:i w:val="0"/>
+          <w:sz w:val="22"/>
+        </w:rPr>
+        <w:t>Has either utility provided any data on planned substation hardening investments for the substations serving these installations?</w:t>
+      </w:r>
+    </w:p>
+    <w:p>
+      <w:pPr>
+        <w:pStyle w:val="ListBullet"/>
+        <w:spacing w:after="60"/>
+        <w:ind w:left="360"/>
+      </w:pPr>
+      <w:r>
+        <w:rPr>
+          <w:rFonts w:ascii="Calibri" w:hAnsi="Calibri"/>
+          <w:b w:val="0"/>
+          <w:i w:val="0"/>
+          <w:sz w:val="22"/>
+        </w:rPr>
+        <w:t>What would an expanded IGSA with resilience provisions actually need to include to be operationally meaningful?</w:t>
+      </w:r>
+    </w:p>
+    <w:p>
+      <w:pPr>
+        <w:spacing w:after="100"/>
+        <w:ind w:left="432"/>
+      </w:pPr>
+      <w:r>
+        <w:rPr>
+          <w:rFonts w:ascii="Calibri" w:hAnsi="Calibri"/>
+          <w:b w:val="0"/>
+          <w:i/>
+          <w:color w:val="595959"/>
+          <w:sz w:val="22"/>
+        </w:rPr>
+        <w:t>Note: These are questions for utility coordination discussions and NAVFAC engagement — not answerable through GIS alone.</w:t>
+      </w:r>
+    </w:p>
+    <w:p>
+      <w:pPr>
+        <w:spacing w:before="280" w:after="80"/>
+      </w:pPr>
+      <w:r>
+        <w:rPr>
+          <w:rFonts w:ascii="Calibri" w:hAnsi="Calibri"/>
+          <w:b/>
+          <w:i w:val="0"/>
+          <w:color w:val="1F497D"/>
+          <w:sz w:val="26"/>
+        </w:rPr>
+        <w:t>6. What GIS Analysis Would Contribute</w:t>
       </w:r>
     </w:p>
     <w:p>
@@ -1697,12 +1904,14 @@
           <w:i w:val="0"/>
           <w:sz w:val="22"/>
         </w:rPr>
-        <w:t>This means operational continuity at all four installations is contingent on civilian utility performance under conditions those utilities have no contractual obligation to prioritize for military restoration timelines. The gap between utility standard restoration timelines (days for major events) and mission-critical requirements (hours) is unaddressed in the current framework.</w:t>
+        <w:t>GIS does not create the vulnerabilities identified in this document — those are already confirmed by the MIRR process. What GIS adds is:</w:t>
       </w:r>
     </w:p>
     <w:p>
       <w:pPr>
-        <w:spacing w:after="120"/>
+        <w:pStyle w:val="ListBullet"/>
+        <w:spacing w:after="60"/>
+        <w:ind w:left="360"/>
       </w:pPr>
       <w:r>
         <w:rPr>
@@ -1711,27 +1920,14 @@
           <w:i w:val="0"/>
           <w:sz w:val="22"/>
         </w:rPr>
-        <w:t>MIRR Regional Recommendation R-2 — IGSA expansion and FPL coordination — is the first step toward closing this gap. It is an administrative action requiring no capital. Until it is in place, the dependency remains structurally unmitigated across all four installations.</w:t>
+        <w:t>Spatial confirmation — showing exactly where confirmed SPOFs sit relative to confirmed hazard zones, moving from qualitative descriptions to measurable overlap</w:t>
       </w:r>
     </w:p>
     <w:p>
       <w:pPr>
-        <w:spacing w:before="280" w:after="80"/>
-      </w:pPr>
-      <w:r>
-        <w:rPr>
-          <w:rFonts w:ascii="Calibri" w:hAnsi="Calibri"/>
-          <w:b/>
-          <w:i w:val="0"/>
-          <w:color w:val="1F497D"/>
-          <w:sz w:val="28"/>
-        </w:rPr>
-        <w:t>7. Data and GIS Gaps — What Still Needs Verification</w:t>
-      </w:r>
-    </w:p>
-    <w:p>
-      <w:pPr>
-        <w:spacing w:after="120"/>
+        <w:pStyle w:val="ListBullet"/>
+        <w:spacing w:after="60"/>
+        <w:ind w:left="360"/>
       </w:pPr>
       <w:r>
         <w:rPr>
@@ -1740,9 +1936,42 @@
           <w:i w:val="0"/>
           <w:sz w:val="22"/>
         </w:rPr>
-        <w:t>The following findings are identified concerns grounded in MIRR documents and intern research. They should be treated as confirmed vulnerabilities requiring GIS analysis before being presented as spatially verified findings.</w:t>
+        <w:t>Quantification — flood depth at substation locations, distance from SPOF to nearest alternative access route, extent of surge inundation along restoration corridors</w:t>
       </w:r>
     </w:p>
+    <w:p>
+      <w:pPr>
+        <w:pStyle w:val="ListBullet"/>
+        <w:spacing w:after="60"/>
+        <w:ind w:left="360"/>
+      </w:pPr>
+      <w:r>
+        <w:rPr>
+          <w:rFonts w:ascii="Calibri" w:hAnsi="Calibri"/>
+          <w:b w:val="0"/>
+          <w:i w:val="0"/>
+          <w:sz w:val="22"/>
+        </w:rPr>
+        <w:t>Visual communication — maps that make the cascade mechanism legible to decision-makers who may not engage with tabular vulnerability data</w:t>
+      </w:r>
+    </w:p>
+    <w:p>
+      <w:pPr>
+        <w:pStyle w:val="ListBullet"/>
+        <w:spacing w:after="60"/>
+        <w:ind w:left="360"/>
+      </w:pPr>
+      <w:r>
+        <w:rPr>
+          <w:rFonts w:ascii="Calibri" w:hAnsi="Calibri"/>
+          <w:b w:val="0"/>
+          <w:i w:val="0"/>
+          <w:sz w:val="22"/>
+        </w:rPr>
+        <w:t>New findings — spatial relationships the documents imply but don't confirm, such as the US-17 transmission corridor claim and the landfill proximity question</w:t>
+      </w:r>
+    </w:p>
+    <w:p/>
     <w:tbl>
       <w:tblPr>
         <w:tblStyle w:val="TableGrid"/>
@@ -1789,10 +2018,11 @@
               <w:rPr>
                 <w:rFonts w:ascii="Calibri" w:hAnsi="Calibri"/>
                 <w:b/>
+                <w:i w:val="0"/>
                 <w:color w:val="FFFFFF"/>
                 <w:sz w:val="19"/>
               </w:rPr>
-              <w:t>Gap</w:t>
+              <w:t>Analysis</w:t>
             </w:r>
           </w:p>
         </w:tc>
@@ -1810,10 +2040,11 @@
               <w:rPr>
                 <w:rFonts w:ascii="Calibri" w:hAnsi="Calibri"/>
                 <w:b/>
+                <w:i w:val="0"/>
                 <w:color w:val="FFFFFF"/>
                 <w:sz w:val="19"/>
               </w:rPr>
-              <w:t>Current Status</w:t>
+              <w:t>Datasets Needed</w:t>
             </w:r>
           </w:p>
         </w:tc>
@@ -1831,10 +2062,11 @@
               <w:rPr>
                 <w:rFonts w:ascii="Calibri" w:hAnsi="Calibri"/>
                 <w:b/>
+                <w:i w:val="0"/>
                 <w:color w:val="FFFFFF"/>
                 <w:sz w:val="19"/>
               </w:rPr>
-              <w:t>What GIS/Data Would Confirm</w:t>
+              <w:t>What It Would Confirm</w:t>
             </w:r>
           </w:p>
         </w:tc>
@@ -1853,9 +2085,10 @@
               <w:rPr>
                 <w:rFonts w:ascii="Calibri" w:hAnsi="Calibri"/>
                 <w:b w:val="0"/>
+                <w:i w:val="0"/>
                 <w:sz w:val="19"/>
               </w:rPr>
-              <w:t>US-17 transmission line routing</w:t>
+              <w:t>Substation vs. flood zone overlay</w:t>
             </w:r>
           </w:p>
         </w:tc>
@@ -1872,9 +2105,10 @@
               <w:rPr>
                 <w:rFonts w:ascii="Calibri" w:hAnsi="Calibri"/>
                 <w:b w:val="0"/>
+                <w:i w:val="0"/>
                 <w:sz w:val="19"/>
               </w:rPr>
-              <w:t>Identified in intern research as common SPOF corridor; not yet spatially verified</w:t>
+              <w:t>HIFLD substations, NHC SLOSH, NEFRC CDBG</w:t>
             </w:r>
           </w:p>
         </w:tc>
@@ -1891,9 +2125,10 @@
               <w:rPr>
                 <w:rFonts w:ascii="Calibri" w:hAnsi="Calibri"/>
                 <w:b w:val="0"/>
+                <w:i w:val="0"/>
                 <w:sz w:val="19"/>
               </w:rPr>
-              <w:t>Which specific transmission lines run along US-17; which installations they serve</w:t>
+              <w:t>Which substations are within Cat 3/5 surge or 100-yr flood extents</w:t>
             </w:r>
           </w:p>
         </w:tc>
@@ -1912,9 +2147,10 @@
               <w:rPr>
                 <w:rFonts w:ascii="Calibri" w:hAnsi="Calibri"/>
                 <w:b w:val="0"/>
+                <w:i w:val="0"/>
                 <w:sz w:val="19"/>
               </w:rPr>
-              <w:t>Substation locations vs. flood zones</w:t>
+              <w:t>Transportation SPOF vs. flood zone</w:t>
             </w:r>
           </w:p>
         </w:tc>
@@ -1931,9 +2167,10 @@
               <w:rPr>
                 <w:rFonts w:ascii="Calibri" w:hAnsi="Calibri"/>
                 <w:b w:val="0"/>
+                <w:i w:val="0"/>
                 <w:sz w:val="19"/>
               </w:rPr>
-              <w:t>MIRR VA confirms flood exposure qualitatively; no spatial overlay yet</w:t>
+              <w:t>FDOT road network, same flood layers</w:t>
             </w:r>
           </w:p>
         </w:tc>
@@ -1950,9 +2187,10 @@
               <w:rPr>
                 <w:rFonts w:ascii="Calibri" w:hAnsi="Calibri"/>
                 <w:b w:val="0"/>
+                <w:i w:val="0"/>
                 <w:sz w:val="19"/>
               </w:rPr>
-              <w:t>Intersection of HIFLD substations with SLOSH Cat 3/5 and CDBG flood layers</w:t>
+              <w:t>Which access corridors close at which storm frequencies</w:t>
             </w:r>
           </w:p>
         </w:tc>
@@ -1971,6 +2209,69 @@
               <w:rPr>
                 <w:rFonts w:ascii="Calibri" w:hAnsi="Calibri"/>
                 <w:b w:val="0"/>
+                <w:i w:val="0"/>
+                <w:sz w:val="19"/>
+              </w:rPr>
+              <w:t>US-17 transmission corridor</w:t>
+            </w:r>
+          </w:p>
+        </w:tc>
+        <w:tc>
+          <w:tcPr>
+            <w:tcW w:type="dxa" w:w="2880"/>
+          </w:tcPr>
+          <w:p>
+            <w:pPr>
+              <w:spacing w:after="40"/>
+            </w:pPr>
+            <w:r/>
+            <w:r>
+              <w:rPr>
+                <w:rFonts w:ascii="Calibri" w:hAnsi="Calibri"/>
+                <w:b w:val="0"/>
+                <w:i w:val="0"/>
+                <w:sz w:val="19"/>
+              </w:rPr>
+              <w:t>EIA transmission lines, HIFLD</w:t>
+            </w:r>
+          </w:p>
+        </w:tc>
+        <w:tc>
+          <w:tcPr>
+            <w:tcW w:type="dxa" w:w="2880"/>
+          </w:tcPr>
+          <w:p>
+            <w:pPr>
+              <w:spacing w:after="40"/>
+            </w:pPr>
+            <w:r/>
+            <w:r>
+              <w:rPr>
+                <w:rFonts w:ascii="Calibri" w:hAnsi="Calibri"/>
+                <w:b w:val="0"/>
+                <w:i w:val="0"/>
+                <w:sz w:val="19"/>
+              </w:rPr>
+              <w:t>Whether transmission lines along US-17 serve MIRR installations</w:t>
+            </w:r>
+          </w:p>
+        </w:tc>
+      </w:tr>
+      <w:tr>
+        <w:tc>
+          <w:tcPr>
+            <w:tcW w:type="dxa" w:w="2880"/>
+          </w:tcPr>
+          <w:p>
+            <w:pPr>
+              <w:spacing w:after="40"/>
+            </w:pPr>
+            <w:r/>
+            <w:r>
+              <w:rPr>
+                <w:rFonts w:ascii="Calibri" w:hAnsi="Calibri"/>
+                <w:b w:val="0"/>
+                <w:i w:val="0"/>
                 <w:sz w:val="19"/>
               </w:rPr>
               <w:t>FPL corridor wildfire exposure</w:t>
@@ -1990,9 +2291,10 @@
               <w:rPr>
                 <w:rFonts w:ascii="Calibri" w:hAnsi="Calibri"/>
                 <w:b w:val="0"/>
+                <w:i w:val="0"/>
                 <w:sz w:val="19"/>
               </w:rPr>
-              <w:t>Identified qualitatively from USDA FS data and MIRR findings</w:t>
+              <w:t>USDA FS wildfire WUI, EIA transmission lines</w:t>
             </w:r>
           </w:p>
         </w:tc>
@@ -2009,9 +2311,10 @@
               <w:rPr>
                 <w:rFonts w:ascii="Calibri" w:hAnsi="Calibri"/>
                 <w:b w:val="0"/>
+                <w:i w:val="0"/>
                 <w:sz w:val="19"/>
               </w:rPr>
-              <w:t>Spatial overlay of USDA wildfire WUI with FPL transmission corridor to Blanding</w:t>
+              <w:t>Extent of wildfire hazard along Camp Blanding's supply corridor</w:t>
             </w:r>
           </w:p>
         </w:tc>
@@ -2030,9 +2333,10 @@
               <w:rPr>
                 <w:rFonts w:ascii="Calibri" w:hAnsi="Calibri"/>
                 <w:b w:val="0"/>
+                <w:i w:val="0"/>
                 <w:sz w:val="19"/>
               </w:rPr>
-              <w:t>Landfill proximity to installations</w:t>
+              <w:t>Landfill proximity mapping</w:t>
             </w:r>
           </w:p>
         </w:tc>
@@ -2049,9 +2353,10 @@
               <w:rPr>
                 <w:rFonts w:ascii="Calibri" w:hAnsi="Calibri"/>
                 <w:b w:val="0"/>
+                <w:i w:val="0"/>
                 <w:sz w:val="19"/>
               </w:rPr>
-              <w:t>Flagged as area to explore; no mapping done</w:t>
+              <w:t>EPA facility data, FDEP, installation boundaries</w:t>
             </w:r>
           </w:p>
         </w:tc>
@@ -2068,9 +2373,10 @@
               <w:rPr>
                 <w:rFonts w:ascii="Calibri" w:hAnsi="Calibri"/>
                 <w:b w:val="0"/>
+                <w:i w:val="0"/>
                 <w:sz w:val="19"/>
               </w:rPr>
-              <w:t>Distance and feasibility of methane pipeline routing to NAS JAX and Blount Island</w:t>
+              <w:t>Distance and routing feasibility for methane pipeline investigation</w:t>
             </w:r>
           </w:p>
         </w:tc>
@@ -2089,9 +2395,10 @@
               <w:rPr>
                 <w:rFonts w:ascii="Calibri" w:hAnsi="Calibri"/>
                 <w:b w:val="0"/>
+                <w:i w:val="0"/>
                 <w:sz w:val="19"/>
               </w:rPr>
-              <w:t>JEA substation exact locations</w:t>
+              <w:t>Contamination sites vs. flood zones</w:t>
             </w:r>
           </w:p>
         </w:tc>
@@ -2108,9 +2415,10 @@
               <w:rPr>
                 <w:rFonts w:ascii="Calibri" w:hAnsi="Calibri"/>
                 <w:b w:val="0"/>
+                <w:i w:val="0"/>
                 <w:sz w:val="19"/>
               </w:rPr>
-              <w:t>EIA Form 860 and HIFLD used as proxies; JEA data not yet shared</w:t>
+              <w:t>EPA ECHO, FDEP, FEMA NFHL</w:t>
             </w:r>
           </w:p>
         </w:tc>
@@ -2127,9 +2435,10 @@
               <w:rPr>
                 <w:rFonts w:ascii="Calibri" w:hAnsi="Calibri"/>
                 <w:b w:val="0"/>
+                <w:i w:val="0"/>
                 <w:sz w:val="19"/>
               </w:rPr>
-              <w:t>Confirmed substation coordinates, condition ratings, planned hardening investments</w:t>
+              <w:t>Flood-mobilized contamination risk near Blount Island and NAS JAX</w:t>
             </w:r>
           </w:p>
         </w:tc>
@@ -2146,9 +2455,23 @@
           <w:b/>
           <w:i w:val="0"/>
           <w:color w:val="1F497D"/>
-          <w:sz w:val="28"/>
+          <w:sz w:val="26"/>
         </w:rPr>
-        <w:t>Sources</w:t>
+        <w:t>7. Sources</w:t>
+      </w:r>
+    </w:p>
+    <w:p>
+      <w:pPr>
+        <w:spacing w:after="120"/>
+      </w:pPr>
+      <w:r>
+        <w:rPr>
+          <w:rFonts w:ascii="Calibri" w:hAnsi="Calibri"/>
+          <w:b w:val="0"/>
+          <w:i w:val="0"/>
+          <w:sz w:val="22"/>
+        </w:rPr>
+        <w:t>All vulnerability findings cited in this document are sourced to the following MIRR project materials. No independent GIS analysis has been performed by this team.</w:t>
       </w:r>
     </w:p>
     <w:p>
@@ -2260,7 +2583,23 @@
           <w:i w:val="0"/>
           <w:sz w:val="22"/>
         </w:rPr>
-        <w:t>APTIM Memo: NE MIRR Evaluating Potential Adaptation Solutions — May 22, 2026 (Sections 1.1, 3.2, 5–6)</w:t>
+        <w:t>NEFRC MIRR Stakeholder Workshop 1 Summary V2</w:t>
+      </w:r>
+    </w:p>
+    <w:p>
+      <w:pPr>
+        <w:pStyle w:val="ListBullet"/>
+        <w:spacing w:after="60"/>
+        <w:ind w:left="360"/>
+      </w:pPr>
+      <w:r>
+        <w:rPr>
+          <w:rFonts w:ascii="Calibri" w:hAnsi="Calibri"/>
+          <w:b w:val="0"/>
+          <w:i w:val="0"/>
+          <w:sz w:val="22"/>
+        </w:rPr>
+        <w:t>APTIM Memo: NE MIRR Evaluating Potential Adaptation Solutions — May 22, 2026</w:t>
       </w:r>
     </w:p>
     <w:p>

</xml_diff>